<commit_message>
Pre Claude Pro integration
</commit_message>
<xml_diff>
--- a/Documentation/JACS Tech Spec 3.0.docx
+++ b/Documentation/JACS Tech Spec 3.0.docx
@@ -37,7 +37,7 @@
           <w:i/>
           <w:iCs/>
         </w:rPr>
-        <w:t>Third</w:t>
+        <w:t>Fourth</w:t>
       </w:r>
       <w:r>
         <w:rPr>
@@ -140,7 +140,10 @@
       </w:r>
       <w:proofErr w:type="spellStart"/>
       <w:r>
-        <w:t>createHearing</w:t>
+        <w:t>create</w:t>
+      </w:r>
+      <w:r>
+        <w:t>Event</w:t>
       </w:r>
       <w:proofErr w:type="spellEnd"/>
     </w:p>
@@ -198,24 +201,63 @@
       </w:r>
       <w:r>
         <w:br/>
+      </w:r>
+      <w:r>
+        <w:t xml:space="preserve">  "</w:t>
+      </w:r>
+      <w:proofErr w:type="spellStart"/>
+      <w:r>
+        <w:t>CaseId</w:t>
+      </w:r>
+      <w:proofErr w:type="spellEnd"/>
+      <w:r>
+        <w:t>": 12345,</w:t>
+      </w:r>
+      <w:r>
+        <w:br/>
+      </w:r>
+      <w:r>
+        <w:t xml:space="preserve">  "</w:t>
+      </w:r>
+      <w:proofErr w:type="spellStart"/>
+      <w:r>
+        <w:t>JudgeId</w:t>
+      </w:r>
+      <w:proofErr w:type="spellEnd"/>
+      <w:r>
+        <w:t>": 154,</w:t>
+      </w:r>
+      <w:r>
         <w:t xml:space="preserve">  </w:t>
       </w:r>
       <w:r>
-        <w:t>"</w:t>
+        <w:br/>
+      </w:r>
+      <w:r>
+        <w:t xml:space="preserve">  "Action": "New",</w:t>
+      </w:r>
+      <w:r>
+        <w:t xml:space="preserve"> </w:t>
+      </w:r>
+      <w:r>
+        <w:br/>
+      </w:r>
+      <w:r>
+        <w:t xml:space="preserve">  "</w:t>
       </w:r>
       <w:proofErr w:type="spellStart"/>
       <w:r>
-        <w:t>CaseNumber</w:t>
+        <w:t>EventType</w:t>
+      </w:r>
+      <w:r>
+        <w:t>Id</w:t>
       </w:r>
       <w:proofErr w:type="spellEnd"/>
       <w:r>
-        <w:t>": "58-2025-SC-006484-XXXA-SC",</w:t>
-      </w:r>
-      <w:r>
-        <w:br/>
-      </w:r>
-      <w:r>
-        <w:t xml:space="preserve">  "Petitioner": "LAST, FIRST OR BUSINESS NAME",</w:t>
+        <w:t xml:space="preserve">": </w:t>
+      </w:r>
+      <w:r>
+        <w:t>1535,</w:t>
       </w:r>
       <w:r>
         <w:br/>
@@ -225,17 +267,14 @@
       </w:r>
       <w:proofErr w:type="spellStart"/>
       <w:r>
-        <w:t>PetitionerAttyBar</w:t>
+        <w:t>Other</w:t>
+      </w:r>
+      <w:r>
+        <w:t>EventType</w:t>
       </w:r>
       <w:proofErr w:type="spellEnd"/>
       <w:r>
-        <w:t>": "FL BAR NUMBER",</w:t>
-      </w:r>
-      <w:r>
-        <w:br/>
-      </w:r>
-      <w:r>
-        <w:t xml:space="preserve">  "Respondent": "LAST, FIRST OR BUSINESS NAME",</w:t>
+        <w:t>": "User Value",</w:t>
       </w:r>
       <w:r>
         <w:br/>
@@ -245,11 +284,69 @@
       </w:r>
       <w:proofErr w:type="spellStart"/>
       <w:r>
-        <w:t>RespondentAttyBar</w:t>
+        <w:t>HearingDate</w:t>
+      </w:r>
+      <w:r>
+        <w:t>Time</w:t>
       </w:r>
       <w:proofErr w:type="spellEnd"/>
       <w:r>
-        <w:t>": "FL BAR NUMBER",</w:t>
+        <w:t>": "</w:t>
+      </w:r>
+      <w:proofErr w:type="spellStart"/>
+      <w:r>
+        <w:t>yyyy</w:t>
+      </w:r>
+      <w:proofErr w:type="spellEnd"/>
+      <w:r>
+        <w:t>-</w:t>
+      </w:r>
+      <w:r>
+        <w:t>mm</w:t>
+      </w:r>
+      <w:r>
+        <w:t>-</w:t>
+      </w:r>
+      <w:r>
+        <w:t>dd</w:t>
+      </w:r>
+      <w:r>
+        <w:t xml:space="preserve"> </w:t>
+      </w:r>
+      <w:proofErr w:type="spellStart"/>
+      <w:r>
+        <w:t>hh</w:t>
+      </w:r>
+      <w:r>
+        <w:t>:</w:t>
+      </w:r>
+      <w:r>
+        <w:t>mm</w:t>
+      </w:r>
+      <w:r>
+        <w:t>:</w:t>
+      </w:r>
+      <w:r>
+        <w:t>ss</w:t>
+      </w:r>
+      <w:proofErr w:type="spellEnd"/>
+      <w:r>
+        <w:t>",</w:t>
+      </w:r>
+      <w:r>
+        <w:t xml:space="preserve"> </w:t>
+      </w:r>
+      <w:r>
+        <w:rPr>
+          <w:color w:val="3A7C22" w:themeColor="accent6" w:themeShade="BF"/>
+        </w:rPr>
+        <w:t>-- includes Start Time</w:t>
+      </w:r>
+      <w:r>
+        <w:br/>
+      </w:r>
+      <w:r>
+        <w:t xml:space="preserve">  "Duration": 15,</w:t>
       </w:r>
       <w:r>
         <w:br/>
@@ -259,135 +356,17 @@
       </w:r>
       <w:proofErr w:type="spellStart"/>
       <w:r>
-        <w:t>CaseId</w:t>
+        <w:t>CourtRoomId</w:t>
       </w:r>
       <w:proofErr w:type="spellEnd"/>
       <w:r>
-        <w:t>": 12345,</w:t>
-      </w:r>
-      <w:r>
-        <w:br/>
-      </w:r>
-      <w:r>
-        <w:t xml:space="preserve">  "</w:t>
-      </w:r>
-      <w:proofErr w:type="spellStart"/>
-      <w:r>
-        <w:t>CourtName</w:t>
-      </w:r>
-      <w:proofErr w:type="spellEnd"/>
-      <w:r>
-        <w:t>": "CIRCUIT CIVIL DIV A, SARASOTA",</w:t>
-      </w:r>
-      <w:r>
-        <w:br/>
-      </w:r>
-      <w:r>
-        <w:t xml:space="preserve">  "</w:t>
-      </w:r>
-      <w:proofErr w:type="spellStart"/>
-      <w:r>
-        <w:t>JudgeId</w:t>
-      </w:r>
-      <w:proofErr w:type="spellEnd"/>
-      <w:r>
-        <w:t>": 154,</w:t>
-      </w:r>
-      <w:r>
-        <w:br/>
-      </w:r>
-      <w:r>
-        <w:t xml:space="preserve">  "Action": "New",</w:t>
-      </w:r>
-      <w:r>
-        <w:br/>
-      </w:r>
-      <w:r>
-        <w:t xml:space="preserve">  "</w:t>
-      </w:r>
-      <w:proofErr w:type="spellStart"/>
-      <w:r>
-        <w:t>MotionDesc</w:t>
-      </w:r>
-      <w:proofErr w:type="spellEnd"/>
-      <w:r>
-        <w:t>": "DISMISS",</w:t>
-      </w:r>
-      <w:r>
-        <w:br/>
-      </w:r>
-      <w:r>
-        <w:t xml:space="preserve">  "</w:t>
-      </w:r>
-      <w:proofErr w:type="spellStart"/>
-      <w:r>
-        <w:t>MotionOther</w:t>
-      </w:r>
-      <w:proofErr w:type="spellEnd"/>
-      <w:r>
-        <w:t>": "User Value",</w:t>
-      </w:r>
-      <w:r>
-        <w:br/>
-      </w:r>
-      <w:r>
-        <w:t xml:space="preserve">  "</w:t>
-      </w:r>
-      <w:proofErr w:type="spellStart"/>
-      <w:r>
-        <w:t>HearingDate</w:t>
-      </w:r>
-      <w:proofErr w:type="spellEnd"/>
-      <w:r>
-        <w:t>": "2025-08-05",</w:t>
-      </w:r>
-      <w:r>
-        <w:br/>
-      </w:r>
-      <w:r>
-        <w:t xml:space="preserve">  "</w:t>
-      </w:r>
-      <w:proofErr w:type="spellStart"/>
-      <w:r>
-        <w:t>StartTime</w:t>
-      </w:r>
-      <w:proofErr w:type="spellEnd"/>
-      <w:r>
-        <w:t>": "1545",</w:t>
-      </w:r>
-      <w:r>
-        <w:br/>
-      </w:r>
-      <w:r>
-        <w:t xml:space="preserve">  "Duration": 15,</w:t>
-      </w:r>
-      <w:r>
-        <w:br/>
-      </w:r>
-      <w:r>
-        <w:t xml:space="preserve">  "</w:t>
-      </w:r>
-      <w:proofErr w:type="spellStart"/>
-      <w:r>
-        <w:t>CourtRoomId</w:t>
-      </w:r>
-      <w:proofErr w:type="spellEnd"/>
-      <w:r>
         <w:t>": 25,</w:t>
       </w:r>
       <w:r>
         <w:br/>
       </w:r>
       <w:r>
-        <w:t xml:space="preserve">  "</w:t>
-      </w:r>
-      <w:proofErr w:type="spellStart"/>
-      <w:r>
-        <w:t>HearingNotes</w:t>
-      </w:r>
-      <w:proofErr w:type="spellEnd"/>
-      <w:r>
-        <w:t>": "REAL PROPERTY - DOCS COMPLETE",</w:t>
+        <w:t xml:space="preserve">  "Notes": "REAL PROPERTY - DOCS COMPLETE",</w:t>
       </w:r>
       <w:r>
         <w:br/>
@@ -402,11 +381,19 @@
         <w:rPr>
           <w:i/>
           <w:iCs/>
-          <w:color w:val="124F1A" w:themeColor="accent3" w:themeShade="BF"/>
+          <w:color w:val="3A7C22" w:themeColor="accent6" w:themeShade="BF"/>
         </w:rPr>
         <w:t>//User Defined Fields</w:t>
       </w:r>
       <w:r>
+        <w:rPr>
+          <w:i/>
+          <w:iCs/>
+          <w:color w:val="3A7C22" w:themeColor="accent6" w:themeShade="BF"/>
+        </w:rPr>
+        <w:t>. These are examples all values will be strings</w:t>
+      </w:r>
+      <w:r>
         <w:br/>
       </w:r>
       <w:r>
@@ -428,15 +415,7 @@
         <w:t xml:space="preserve">     </w:t>
       </w:r>
       <w:r>
-        <w:t>"</w:t>
-      </w:r>
-      <w:proofErr w:type="spellStart"/>
-      <w:r>
-        <w:t>Plaintiff_|left_|text</w:t>
-      </w:r>
-      <w:proofErr w:type="spellEnd"/>
-      <w:r>
-        <w:t>": "Joe Terhune",</w:t>
+        <w:t>"Plaintiff": "Joe Terhune",</w:t>
       </w:r>
       <w:r>
         <w:br/>
@@ -448,15 +427,7 @@
         <w:t xml:space="preserve">     </w:t>
       </w:r>
       <w:r>
-        <w:t>"</w:t>
-      </w:r>
-      <w:proofErr w:type="spellStart"/>
-      <w:r>
-        <w:t>Defendant_|right_|text</w:t>
-      </w:r>
-      <w:proofErr w:type="spellEnd"/>
-      <w:r>
-        <w:t>": "Chris Schrieber",</w:t>
+        <w:t>"Defendant": "Chris Schrieber",</w:t>
       </w:r>
       <w:r>
         <w:br/>
@@ -468,15 +439,7 @@
         <w:t xml:space="preserve">     </w:t>
       </w:r>
       <w:r>
-        <w:t>"Interpreter Required?_|center_|</w:t>
-      </w:r>
-      <w:proofErr w:type="spellStart"/>
-      <w:r>
-        <w:t>yes_no</w:t>
-      </w:r>
-      <w:proofErr w:type="spellEnd"/>
-      <w:r>
-        <w:t>": "no",</w:t>
+        <w:t>"Interpreter Required": "no",</w:t>
       </w:r>
       <w:r>
         <w:br/>
@@ -488,7 +451,7 @@
         <w:t xml:space="preserve">     </w:t>
       </w:r>
       <w:r>
-        <w:t>"Docket ID #_|left_|number": "41"</w:t>
+        <w:t>"Docket ID": "41"</w:t>
       </w:r>
       <w:r>
         <w:br/>
@@ -498,6 +461,9 @@
       </w:r>
       <w:r>
         <w:t>}</w:t>
+      </w:r>
+      <w:r>
+        <w:t>,</w:t>
       </w:r>
       <w:r>
         <w:br/>
@@ -530,45 +496,47 @@
           <w:ilvl w:val="1"/>
           <w:numId w:val="5"/>
         </w:numPr>
-      </w:pPr>
-      <w:r>
-        <w:lastRenderedPageBreak/>
-        <w:t xml:space="preserve">Success (201 Created): </w:t>
-      </w:r>
-      <w:proofErr w:type="gramStart"/>
-      <w:r>
-        <w:t>{ "</w:t>
+        <w:rPr>
+          <w:color w:val="3A7C22" w:themeColor="accent6" w:themeShade="BF"/>
+        </w:rPr>
+      </w:pPr>
+      <w:r>
+        <w:t>Success (</w:t>
+      </w:r>
+      <w:r>
+        <w:rPr>
+          <w:highlight w:val="yellow"/>
+        </w:rPr>
+        <w:t>20</w:t>
+      </w:r>
+      <w:r>
+        <w:rPr>
+          <w:highlight w:val="yellow"/>
+        </w:rPr>
+        <w:t>1</w:t>
+      </w:r>
+      <w:r>
+        <w:t>): { "</w:t>
       </w:r>
       <w:proofErr w:type="spellStart"/>
-      <w:proofErr w:type="gramEnd"/>
-      <w:r>
-        <w:t>HearingId</w:t>
+      <w:r>
+        <w:t>Event</w:t>
+      </w:r>
+      <w:r>
+        <w:t>Id</w:t>
       </w:r>
       <w:proofErr w:type="spellEnd"/>
       <w:r>
-        <w:t xml:space="preserve">": 123456, </w:t>
-      </w:r>
-      <w:r>
-        <w:t>“</w:t>
-      </w:r>
-      <w:proofErr w:type="spellStart"/>
-      <w:r>
-        <w:t>CaseId</w:t>
-      </w:r>
-      <w:proofErr w:type="spellEnd"/>
-      <w:r>
-        <w:t xml:space="preserve">”: 2345, </w:t>
-      </w:r>
-      <w:r>
-        <w:t>"</w:t>
-      </w:r>
-      <w:proofErr w:type="spellStart"/>
-      <w:r>
-        <w:t>errorMsg</w:t>
-      </w:r>
-      <w:proofErr w:type="spellEnd"/>
-      <w:r>
-        <w:t>": "" }</w:t>
+        <w:t>": 123456</w:t>
+      </w:r>
+      <w:r>
+        <w:t xml:space="preserve">, </w:t>
+      </w:r>
+      <w:r>
+        <w:t>"error": "" }</w:t>
+      </w:r>
+      <w:r>
+        <w:t xml:space="preserve"> </w:t>
       </w:r>
     </w:p>
     <w:p>
@@ -579,20 +547,7 @@
         </w:numPr>
       </w:pPr>
       <w:r>
-        <w:t xml:space="preserve">Error (4xx/5xx): </w:t>
-      </w:r>
-      <w:proofErr w:type="gramStart"/>
-      <w:r>
-        <w:t>{ "</w:t>
-      </w:r>
-      <w:proofErr w:type="spellStart"/>
-      <w:proofErr w:type="gramEnd"/>
-      <w:r>
-        <w:t>errorMsg</w:t>
-      </w:r>
-      <w:proofErr w:type="spellEnd"/>
-      <w:r>
-        <w:t>": "Descriptive error message" }</w:t>
+        <w:t>Error (4xx/5xx): { "error": "Descriptive error message" }</w:t>
       </w:r>
     </w:p>
     <w:p>
@@ -619,13 +574,12 @@
           <w:ilvl w:val="1"/>
           <w:numId w:val="5"/>
         </w:numPr>
-        <w:rPr>
-          <w:b/>
-          <w:bCs/>
-        </w:rPr>
-      </w:pPr>
-      <w:r>
-        <w:t>Action must be 'New'. Validates for unique hearing constraints.</w:t>
+      </w:pPr>
+      <w:r>
+        <w:t>Expecting 201 response when successful</w:t>
+      </w:r>
+      <w:r>
+        <w:t>. All others should be 200</w:t>
       </w:r>
     </w:p>
     <w:p>
@@ -634,70 +588,39 @@
           <w:ilvl w:val="1"/>
           <w:numId w:val="5"/>
         </w:numPr>
-        <w:rPr>
-          <w:b/>
-          <w:bCs/>
-        </w:rPr>
-      </w:pPr>
-      <w:r>
-        <w:rPr>
-          <w:b/>
-          <w:bCs/>
-        </w:rPr>
-        <w:t>Example UDF segment:</w:t>
-      </w:r>
-      <w:r>
-        <w:rPr>
-          <w:b/>
-          <w:bCs/>
-        </w:rPr>
-        <w:t xml:space="preserve"> </w:t>
-      </w:r>
-      <w:r>
-        <w:t>{"</w:t>
-      </w:r>
-      <w:proofErr w:type="spellStart"/>
-      <w:r>
-        <w:t>Plaintiff_|left_|text":"Joe</w:t>
-      </w:r>
-      <w:proofErr w:type="spellEnd"/>
-      <w:r>
-        <w:t xml:space="preserve"> </w:t>
-      </w:r>
-      <w:proofErr w:type="spellStart"/>
-      <w:r>
-        <w:t>Terhune","Defendant_|right_|text":"Chris</w:t>
-      </w:r>
-      <w:proofErr w:type="spellEnd"/>
-      <w:r>
-        <w:t xml:space="preserve"> </w:t>
-      </w:r>
-      <w:proofErr w:type="spellStart"/>
-      <w:r>
-        <w:t>Schrieber","Interpreter</w:t>
-      </w:r>
-      <w:proofErr w:type="spellEnd"/>
-      <w:r>
-        <w:t xml:space="preserve"> Required?_|</w:t>
-      </w:r>
-      <w:proofErr w:type="spellStart"/>
-      <w:r>
-        <w:t>center_|yes_no":"no","Docket</w:t>
-      </w:r>
-      <w:proofErr w:type="spellEnd"/>
-      <w:r>
-        <w:t xml:space="preserve"> ID #_|left_|number":"41"}</w:t>
-      </w:r>
-      <w:r>
-        <w:br/>
-      </w:r>
-      <w:r>
-        <w:br/>
-        <w:t xml:space="preserve">Key value pairs in which the Key is pipe delimited to store </w:t>
-      </w:r>
-      <w:r>
-        <w:br/>
-        <w:t>field name, text alignment, data type. We can discuss removing alignment and type.</w:t>
+      </w:pPr>
+      <w:r>
+        <w:t>We</w:t>
+      </w:r>
+      <w:r>
+        <w:t xml:space="preserve"> will be retrieving the case information just before creating the hearing so </w:t>
+      </w:r>
+      <w:r>
+        <w:t xml:space="preserve">we can send Your </w:t>
+      </w:r>
+      <w:r>
+        <w:t>C</w:t>
+      </w:r>
+      <w:r>
+        <w:t>ase</w:t>
+      </w:r>
+      <w:r>
+        <w:t xml:space="preserve"> Id</w:t>
+      </w:r>
+      <w:r>
+        <w:t xml:space="preserve"> instead of </w:t>
+      </w:r>
+      <w:r>
+        <w:t>C</w:t>
+      </w:r>
+      <w:r>
+        <w:t>ase</w:t>
+      </w:r>
+      <w:r>
+        <w:t xml:space="preserve"> N</w:t>
+      </w:r>
+      <w:r>
+        <w:t>umber.</w:t>
       </w:r>
     </w:p>
     <w:p>
@@ -712,59 +635,8 @@
         </w:rPr>
       </w:pPr>
       <w:r>
-        <w:rPr>
-          <w:b/>
-          <w:bCs/>
-        </w:rPr>
-        <w:t>UDF Types:</w:t>
-      </w:r>
-    </w:p>
-    <w:p>
-      <w:pPr>
-        <w:pStyle w:val="ListParagraph"/>
-        <w:numPr>
-          <w:ilvl w:val="2"/>
-          <w:numId w:val="5"/>
-        </w:numPr>
-      </w:pPr>
-      <w:r>
-        <w:t>Text</w:t>
-      </w:r>
-    </w:p>
-    <w:p>
-      <w:pPr>
-        <w:pStyle w:val="ListParagraph"/>
-        <w:numPr>
-          <w:ilvl w:val="2"/>
-          <w:numId w:val="5"/>
-        </w:numPr>
-      </w:pPr>
-      <w:r>
-        <w:t>Number</w:t>
-      </w:r>
-    </w:p>
-    <w:p>
-      <w:pPr>
-        <w:pStyle w:val="ListParagraph"/>
-        <w:numPr>
-          <w:ilvl w:val="2"/>
-          <w:numId w:val="5"/>
-        </w:numPr>
-      </w:pPr>
-      <w:r>
-        <w:t>Date</w:t>
-      </w:r>
-    </w:p>
-    <w:p>
-      <w:pPr>
-        <w:pStyle w:val="ListParagraph"/>
-        <w:numPr>
-          <w:ilvl w:val="2"/>
-          <w:numId w:val="5"/>
-        </w:numPr>
-      </w:pPr>
-      <w:r>
-        <w:t>Yes/No</w:t>
+        <w:lastRenderedPageBreak/>
+        <w:t>Unless there is an issue I will be sending Event Date and Start Time as one datetime value.</w:t>
       </w:r>
     </w:p>
     <w:p>
@@ -787,6 +659,48 @@
           <w:bCs/>
         </w:rPr>
         <w:t>.2 Update Hearing</w:t>
+      </w:r>
+      <w:r>
+        <w:rPr>
+          <w:b/>
+          <w:bCs/>
+        </w:rPr>
+        <w:t xml:space="preserve"> </w:t>
+      </w:r>
+      <w:r>
+        <w:rPr>
+          <w:b/>
+          <w:bCs/>
+        </w:rPr>
+        <w:t>(</w:t>
+      </w:r>
+      <w:r>
+        <w:rPr>
+          <w:b/>
+          <w:bCs/>
+        </w:rPr>
+        <w:t>N</w:t>
+      </w:r>
+      <w:r>
+        <w:rPr>
+          <w:b/>
+          <w:bCs/>
+        </w:rPr>
+        <w:t>ot Resch</w:t>
+      </w:r>
+      <w:r>
+        <w:rPr>
+          <w:b/>
+          <w:bCs/>
+        </w:rPr>
+        <w:t>eduled!</w:t>
+      </w:r>
+      <w:r>
+        <w:rPr>
+          <w:b/>
+          <w:bCs/>
+        </w:rPr>
+        <w:t>)</w:t>
       </w:r>
     </w:p>
     <w:p>
@@ -808,7 +722,10 @@
       </w:r>
       <w:proofErr w:type="spellStart"/>
       <w:r>
-        <w:t>updateHearing</w:t>
+        <w:t>update</w:t>
+      </w:r>
+      <w:r>
+        <w:t>Event</w:t>
       </w:r>
       <w:proofErr w:type="spellEnd"/>
     </w:p>
@@ -865,45 +782,536 @@
         <w:br/>
       </w:r>
       <w:r>
+        <w:t xml:space="preserve">  “</w:t>
+      </w:r>
+      <w:proofErr w:type="spellStart"/>
+      <w:r>
+        <w:t>Event</w:t>
+      </w:r>
+      <w:r>
+        <w:t>Id</w:t>
+      </w:r>
+      <w:proofErr w:type="spellEnd"/>
+      <w:r>
+        <w:t>": 123456,</w:t>
+      </w:r>
+      <w:r>
+        <w:br/>
+      </w:r>
+      <w:r>
+        <w:t xml:space="preserve">  "</w:t>
+      </w:r>
+      <w:proofErr w:type="spellStart"/>
+      <w:r>
+        <w:t>CaseId</w:t>
+      </w:r>
+      <w:proofErr w:type="spellEnd"/>
+      <w:r>
+        <w:t>": 12345,</w:t>
+      </w:r>
+      <w:r>
+        <w:br/>
+      </w:r>
+      <w:r>
+        <w:t xml:space="preserve">  "</w:t>
+      </w:r>
+      <w:proofErr w:type="spellStart"/>
+      <w:r>
+        <w:t>JudgeId</w:t>
+      </w:r>
+      <w:proofErr w:type="spellEnd"/>
+      <w:r>
+        <w:t>": 154,</w:t>
+      </w:r>
+      <w:r>
         <w:t xml:space="preserve">  </w:t>
+      </w:r>
+      <w:r>
+        <w:br/>
+      </w:r>
+      <w:r>
+        <w:t xml:space="preserve">  "Action": "</w:t>
+      </w:r>
+      <w:r>
+        <w:t>Modify</w:t>
+      </w:r>
+      <w:r>
+        <w:t>",</w:t>
+      </w:r>
+      <w:r>
+        <w:t xml:space="preserve"> </w:t>
+      </w:r>
+      <w:r>
+        <w:br/>
+      </w:r>
+      <w:r>
+        <w:t xml:space="preserve">  "</w:t>
+      </w:r>
+      <w:proofErr w:type="spellStart"/>
+      <w:r>
+        <w:t>EventTypeId</w:t>
+      </w:r>
+      <w:proofErr w:type="spellEnd"/>
+      <w:r>
+        <w:t xml:space="preserve">": </w:t>
+      </w:r>
+      <w:r>
+        <w:t>1535,</w:t>
+      </w:r>
+      <w:r>
+        <w:br/>
+      </w:r>
+      <w:r>
+        <w:t xml:space="preserve">  "</w:t>
+      </w:r>
+      <w:proofErr w:type="spellStart"/>
+      <w:r>
+        <w:t>Other</w:t>
+      </w:r>
+      <w:r>
+        <w:t>EventType</w:t>
+      </w:r>
+      <w:proofErr w:type="spellEnd"/>
+      <w:r>
+        <w:t>": "User Value",</w:t>
+      </w:r>
+      <w:r>
+        <w:br/>
+      </w:r>
+      <w:r>
+        <w:t xml:space="preserve">  "</w:t>
+      </w:r>
+      <w:proofErr w:type="spellStart"/>
+      <w:r>
+        <w:t>HearingDate</w:t>
+      </w:r>
+      <w:r>
+        <w:t>Time</w:t>
+      </w:r>
+      <w:proofErr w:type="spellEnd"/>
+      <w:r>
+        <w:t>": "</w:t>
+      </w:r>
+      <w:proofErr w:type="spellStart"/>
+      <w:r>
+        <w:t>yyyy</w:t>
+      </w:r>
+      <w:proofErr w:type="spellEnd"/>
+      <w:r>
+        <w:t>-</w:t>
+      </w:r>
+      <w:r>
+        <w:t>mm</w:t>
+      </w:r>
+      <w:r>
+        <w:t>-</w:t>
+      </w:r>
+      <w:r>
+        <w:t xml:space="preserve">dd </w:t>
+      </w:r>
+      <w:proofErr w:type="spellStart"/>
+      <w:r>
+        <w:t>hh:mm:ss</w:t>
+      </w:r>
+      <w:proofErr w:type="spellEnd"/>
+      <w:r>
+        <w:t>",</w:t>
+      </w:r>
+      <w:r>
+        <w:t xml:space="preserve"> </w:t>
+      </w:r>
+      <w:r>
+        <w:rPr>
+          <w:color w:val="3A7C22" w:themeColor="accent6" w:themeShade="BF"/>
+        </w:rPr>
+        <w:t>-- includes Start Time</w:t>
+      </w:r>
+      <w:r>
+        <w:br/>
+      </w:r>
+      <w:r>
+        <w:t xml:space="preserve">  "Duration": 15,</w:t>
+      </w:r>
+      <w:r>
+        <w:br/>
+      </w:r>
+      <w:r>
+        <w:t xml:space="preserve">  "</w:t>
+      </w:r>
+      <w:proofErr w:type="spellStart"/>
+      <w:r>
+        <w:t>CourtRoomId</w:t>
+      </w:r>
+      <w:proofErr w:type="spellEnd"/>
+      <w:r>
+        <w:t>": 25,</w:t>
+      </w:r>
+      <w:r>
+        <w:br/>
+      </w:r>
+      <w:r>
+        <w:t xml:space="preserve">  "Notes": "REAL PROPERTY - DOCS COMPLETE",</w:t>
+      </w:r>
+      <w:r>
+        <w:br/>
+      </w:r>
+      <w:r>
+        <w:t xml:space="preserve">  "UDF":</w:t>
+      </w:r>
+      <w:r>
+        <w:t xml:space="preserve"> </w:t>
       </w:r>
       <w:r>
         <w:rPr>
           <w:i/>
           <w:iCs/>
-          <w:color w:val="196B24" w:themeColor="accent3"/>
-        </w:rPr>
-        <w:t>Same as Create Hearing, plus:</w:t>
-      </w:r>
-      <w:r>
-        <w:br/>
-      </w:r>
-      <w:r>
-        <w:t xml:space="preserve">  </w:t>
-      </w:r>
-      <w:r>
-        <w:t>"</w:t>
+          <w:color w:val="3A7C22" w:themeColor="accent6" w:themeShade="BF"/>
+        </w:rPr>
+        <w:t>--</w:t>
+      </w:r>
+      <w:r>
+        <w:rPr>
+          <w:i/>
+          <w:iCs/>
+          <w:color w:val="3A7C22" w:themeColor="accent6" w:themeShade="BF"/>
+        </w:rPr>
+        <w:t>User Defined Fields. These are examples all values will be strings</w:t>
+      </w:r>
+      <w:r>
+        <w:br/>
+      </w:r>
+      <w:r>
+        <w:t xml:space="preserve"> </w:t>
+      </w:r>
+      <w:r>
+        <w:t xml:space="preserve">    </w:t>
+      </w:r>
+      <w:r>
+        <w:t>{</w:t>
+      </w:r>
+      <w:r>
+        <w:br/>
+      </w:r>
+      <w:r>
+        <w:t xml:space="preserve">    </w:t>
+      </w:r>
+      <w:r>
+        <w:t xml:space="preserve">     </w:t>
+      </w:r>
+      <w:r>
+        <w:t>"Plaintiff": "Joe Terhune",</w:t>
+      </w:r>
+      <w:r>
+        <w:br/>
+      </w:r>
+      <w:r>
+        <w:t xml:space="preserve">    </w:t>
+      </w:r>
+      <w:r>
+        <w:t xml:space="preserve">     </w:t>
+      </w:r>
+      <w:r>
+        <w:t>"Defendant": "Chris Schrieber",</w:t>
+      </w:r>
+      <w:r>
+        <w:br/>
+      </w:r>
+      <w:r>
+        <w:t xml:space="preserve">    </w:t>
+      </w:r>
+      <w:r>
+        <w:t xml:space="preserve">     </w:t>
+      </w:r>
+      <w:r>
+        <w:t>"Interpreter Required": "no",</w:t>
+      </w:r>
+      <w:r>
+        <w:br/>
+      </w:r>
+      <w:r>
+        <w:t xml:space="preserve">    </w:t>
+      </w:r>
+      <w:r>
+        <w:t xml:space="preserve">     </w:t>
+      </w:r>
+      <w:r>
+        <w:t>"Docket ID": "41"</w:t>
+      </w:r>
+      <w:r>
+        <w:br/>
+        <w:t xml:space="preserve">      },</w:t>
+      </w:r>
+      <w:r>
+        <w:br/>
+      </w:r>
+      <w:r>
+        <w:t xml:space="preserve">  “Reason”: ”Rescheduled to different day / Courtroom updated”,</w:t>
+      </w:r>
+      <w:r>
+        <w:br/>
+      </w:r>
+      <w:r>
+        <w:t>}</w:t>
+      </w:r>
+    </w:p>
+    <w:p>
+      <w:pPr>
+        <w:numPr>
+          <w:ilvl w:val="0"/>
+          <w:numId w:val="5"/>
+        </w:numPr>
+      </w:pPr>
+      <w:r>
+        <w:rPr>
+          <w:b/>
+          <w:bCs/>
+        </w:rPr>
+        <w:t>Response</w:t>
+      </w:r>
+      <w:r>
+        <w:t xml:space="preserve"> (JSON): </w:t>
+      </w:r>
+    </w:p>
+    <w:p>
+      <w:pPr>
+        <w:numPr>
+          <w:ilvl w:val="1"/>
+          <w:numId w:val="5"/>
+        </w:numPr>
+      </w:pPr>
+      <w:r>
+        <w:t>Success (</w:t>
+      </w:r>
+      <w:r>
+        <w:rPr>
+          <w:highlight w:val="yellow"/>
+        </w:rPr>
+        <w:t>200</w:t>
+      </w:r>
+      <w:r>
+        <w:t>)</w:t>
+      </w:r>
+      <w:r>
+        <w:t xml:space="preserve"> </w:t>
+      </w:r>
+      <w:r>
+        <w:rPr>
+          <w:color w:val="3A7C22" w:themeColor="accent6" w:themeShade="BF"/>
+        </w:rPr>
+        <w:t>--</w:t>
+      </w:r>
+      <w:r>
+        <w:rPr>
+          <w:color w:val="3A7C22" w:themeColor="accent6" w:themeShade="BF"/>
+        </w:rPr>
+        <w:t xml:space="preserve"> Standard success response</w:t>
+      </w:r>
+    </w:p>
+    <w:p>
+      <w:pPr>
+        <w:numPr>
+          <w:ilvl w:val="1"/>
+          <w:numId w:val="5"/>
+        </w:numPr>
+      </w:pPr>
+      <w:r>
+        <w:t>Error (4xx/5xx): { "error": "Descriptive error message" }</w:t>
+      </w:r>
+    </w:p>
+    <w:p>
+      <w:pPr>
+        <w:rPr>
+          <w:b/>
+          <w:bCs/>
+        </w:rPr>
+      </w:pPr>
+      <w:r>
+        <w:rPr>
+          <w:b/>
+          <w:bCs/>
+        </w:rPr>
+        <w:t>1</w:t>
+      </w:r>
+      <w:r>
+        <w:rPr>
+          <w:b/>
+          <w:bCs/>
+        </w:rPr>
+        <w:t>.3 Cancel Hearing</w:t>
+      </w:r>
+    </w:p>
+    <w:p>
+      <w:pPr>
+        <w:numPr>
+          <w:ilvl w:val="0"/>
+          <w:numId w:val="7"/>
+        </w:numPr>
+      </w:pPr>
+      <w:r>
+        <w:rPr>
+          <w:b/>
+          <w:bCs/>
+        </w:rPr>
+        <w:t>Endpoint</w:t>
+      </w:r>
+      <w:r>
+        <w:t>: POST /</w:t>
       </w:r>
       <w:proofErr w:type="spellStart"/>
       <w:r>
-        <w:t>HearingId</w:t>
+        <w:t>cancel</w:t>
+      </w:r>
+      <w:r>
+        <w:t>Event</w:t>
       </w:r>
       <w:proofErr w:type="spellEnd"/>
-      <w:r>
-        <w:t xml:space="preserve">": 123456, </w:t>
-      </w:r>
-      <w:r>
-        <w:br/>
-        <w:t xml:space="preserve">  </w:t>
-      </w:r>
-      <w:r>
-        <w:t>"Action": "Modify"</w:t>
-      </w:r>
-      <w:r>
-        <w:br/>
-      </w:r>
-      <w:r>
+    </w:p>
+    <w:p>
+      <w:pPr>
+        <w:numPr>
+          <w:ilvl w:val="0"/>
+          <w:numId w:val="7"/>
+        </w:numPr>
+      </w:pPr>
+      <w:r>
+        <w:rPr>
+          <w:b/>
+          <w:bCs/>
+        </w:rPr>
+        <w:t>Description</w:t>
+      </w:r>
+      <w:r>
+        <w:t xml:space="preserve">: Cancels an existing hearing in </w:t>
+      </w:r>
+      <w:r>
+        <w:t>Clerk System</w:t>
+      </w:r>
+      <w:r>
+        <w:t>.</w:t>
+      </w:r>
+    </w:p>
+    <w:p>
+      <w:pPr>
+        <w:numPr>
+          <w:ilvl w:val="0"/>
+          <w:numId w:val="7"/>
+        </w:numPr>
+      </w:pPr>
+      <w:r>
+        <w:rPr>
+          <w:b/>
+          <w:bCs/>
+        </w:rPr>
+        <w:lastRenderedPageBreak/>
+        <w:t>Request Body</w:t>
+      </w:r>
+      <w:r>
+        <w:t xml:space="preserve"> (JSON): </w:t>
+      </w:r>
+    </w:p>
+    <w:p>
+      <w:pPr>
+        <w:ind w:left="1440"/>
+      </w:pPr>
+      <w:r>
+        <w:t>{</w:t>
+      </w:r>
+      <w:r>
+        <w:br/>
+        <w:t xml:space="preserve">  "</w:t>
+      </w:r>
+      <w:proofErr w:type="spellStart"/>
+      <w:r>
+        <w:t>ClerkEvent</w:t>
+      </w:r>
+      <w:r>
+        <w:t>Id</w:t>
+      </w:r>
+      <w:proofErr w:type="spellEnd"/>
+      <w:r>
+        <w:t>": 123456,</w:t>
+      </w:r>
+      <w:r>
+        <w:br/>
+        <w:t xml:space="preserve">  "Reason": "Update from Clerk System"</w:t>
+      </w:r>
+      <w:r>
+        <w:br/>
         <w:t>}</w:t>
+      </w:r>
+    </w:p>
+    <w:p>
+      <w:pPr>
+        <w:numPr>
+          <w:ilvl w:val="0"/>
+          <w:numId w:val="5"/>
+        </w:numPr>
+      </w:pPr>
+      <w:r>
+        <w:rPr>
+          <w:b/>
+          <w:bCs/>
+        </w:rPr>
+        <w:t>Response</w:t>
+      </w:r>
+      <w:r>
+        <w:t xml:space="preserve"> (JSON): </w:t>
+      </w:r>
+    </w:p>
+    <w:p>
+      <w:pPr>
+        <w:numPr>
+          <w:ilvl w:val="1"/>
+          <w:numId w:val="5"/>
+        </w:numPr>
+      </w:pPr>
+      <w:r>
+        <w:t>Success (</w:t>
+      </w:r>
+      <w:r>
+        <w:rPr>
+          <w:highlight w:val="yellow"/>
+        </w:rPr>
+        <w:t>200</w:t>
+      </w:r>
+      <w:r>
+        <w:t>)</w:t>
+      </w:r>
+      <w:r>
+        <w:t xml:space="preserve"> </w:t>
+      </w:r>
+    </w:p>
+    <w:p>
+      <w:pPr>
+        <w:numPr>
+          <w:ilvl w:val="1"/>
+          <w:numId w:val="5"/>
+        </w:numPr>
+      </w:pPr>
+      <w:r>
+        <w:t>Error (4xx/5xx): { "error": "Descriptive error message" }</w:t>
+      </w:r>
+    </w:p>
+    <w:p>
+      <w:pPr>
+        <w:rPr>
+          <w:b/>
+          <w:bCs/>
+        </w:rPr>
+      </w:pPr>
+      <w:r>
+        <w:rPr>
+          <w:b/>
+          <w:bCs/>
+        </w:rPr>
+        <w:t xml:space="preserve">1.4 </w:t>
+      </w:r>
+      <w:r>
+        <w:rPr>
+          <w:b/>
+          <w:bCs/>
+        </w:rPr>
+        <w:t>Reschedule Hearing</w:t>
       </w:r>
     </w:p>
     <w:p>
@@ -918,39 +1326,25 @@
           <w:b/>
           <w:bCs/>
         </w:rPr>
-        <w:t>Response</w:t>
-      </w:r>
-      <w:r>
-        <w:t>: Same as Create Hearing (200 OK on success).</w:t>
-      </w:r>
-    </w:p>
-    <w:p>
-      <w:pPr>
-        <w:rPr>
-          <w:b/>
-          <w:bCs/>
-        </w:rPr>
-      </w:pPr>
-      <w:r>
-        <w:rPr>
-          <w:b/>
-          <w:bCs/>
-        </w:rPr>
-        <w:t>1</w:t>
-      </w:r>
-      <w:r>
-        <w:rPr>
-          <w:b/>
-          <w:bCs/>
-        </w:rPr>
-        <w:t>.3 Cancel Hearing</w:t>
-      </w:r>
+        <w:t>Endpoint</w:t>
+      </w:r>
+      <w:r>
+        <w:t>: POST /</w:t>
+      </w:r>
+      <w:proofErr w:type="spellStart"/>
+      <w:r>
+        <w:t>update</w:t>
+      </w:r>
+      <w:r>
+        <w:t>Event</w:t>
+      </w:r>
+      <w:proofErr w:type="spellEnd"/>
     </w:p>
     <w:p>
       <w:pPr>
         <w:numPr>
           <w:ilvl w:val="0"/>
-          <w:numId w:val="7"/>
+          <w:numId w:val="6"/>
         </w:numPr>
       </w:pPr>
       <w:r>
@@ -958,22 +1352,23 @@
           <w:b/>
           <w:bCs/>
         </w:rPr>
-        <w:t>Endpoint</w:t>
-      </w:r>
-      <w:r>
-        <w:t>: POST /</w:t>
-      </w:r>
-      <w:proofErr w:type="spellStart"/>
-      <w:r>
-        <w:t>cancelHearing</w:t>
-      </w:r>
-      <w:proofErr w:type="spellEnd"/>
+        <w:t>Description</w:t>
+      </w:r>
+      <w:r>
+        <w:t xml:space="preserve">: Updates an existing hearing in </w:t>
+      </w:r>
+      <w:r>
+        <w:t>Clerk System</w:t>
+      </w:r>
+      <w:r>
+        <w:t>.</w:t>
+      </w:r>
     </w:p>
     <w:p>
       <w:pPr>
         <w:numPr>
           <w:ilvl w:val="0"/>
-          <w:numId w:val="7"/>
+          <w:numId w:val="6"/>
         </w:numPr>
       </w:pPr>
       <w:r>
@@ -981,23 +1376,345 @@
           <w:b/>
           <w:bCs/>
         </w:rPr>
-        <w:t>Description</w:t>
-      </w:r>
-      <w:r>
-        <w:t xml:space="preserve">: Cancels an existing hearing in </w:t>
-      </w:r>
-      <w:r>
-        <w:t>Clerk System</w:t>
-      </w:r>
-      <w:r>
-        <w:t>.</w:t>
+        <w:t>Request Body</w:t>
+      </w:r>
+      <w:r>
+        <w:t xml:space="preserve"> (JSON): </w:t>
+      </w:r>
+    </w:p>
+    <w:p>
+      <w:pPr>
+        <w:ind w:left="1440"/>
+      </w:pPr>
+      <w:r>
+        <w:t>{</w:t>
+      </w:r>
+      <w:r>
+        <w:br/>
+      </w:r>
+      <w:r>
+        <w:t>"</w:t>
+      </w:r>
+      <w:proofErr w:type="spellStart"/>
+      <w:r>
+        <w:t>NewEvent</w:t>
+      </w:r>
+      <w:proofErr w:type="spellEnd"/>
+      <w:r>
+        <w:t>"</w:t>
+      </w:r>
+      <w:r>
+        <w:t xml:space="preserve">: </w:t>
+      </w:r>
+      <w:r>
+        <w:t>{</w:t>
+      </w:r>
+      <w:r>
+        <w:br/>
+      </w:r>
+      <w:r>
+        <w:t xml:space="preserve">  "</w:t>
+      </w:r>
+      <w:proofErr w:type="spellStart"/>
+      <w:r>
+        <w:t>EventId</w:t>
+      </w:r>
+      <w:proofErr w:type="spellEnd"/>
+      <w:r>
+        <w:t>": 123456,</w:t>
+      </w:r>
+      <w:r>
+        <w:br/>
+      </w:r>
+      <w:r>
+        <w:t xml:space="preserve">  "</w:t>
+      </w:r>
+      <w:proofErr w:type="spellStart"/>
+      <w:r>
+        <w:t>CaseId</w:t>
+      </w:r>
+      <w:proofErr w:type="spellEnd"/>
+      <w:r>
+        <w:t>": 12345,</w:t>
+      </w:r>
+      <w:r>
+        <w:br/>
+      </w:r>
+      <w:r>
+        <w:t xml:space="preserve">  "</w:t>
+      </w:r>
+      <w:proofErr w:type="spellStart"/>
+      <w:r>
+        <w:t>JudgeId</w:t>
+      </w:r>
+      <w:proofErr w:type="spellEnd"/>
+      <w:r>
+        <w:t>": 154,</w:t>
+      </w:r>
+      <w:r>
+        <w:br/>
+      </w:r>
+      <w:r>
+        <w:t xml:space="preserve">  "Action": "Modify",</w:t>
+      </w:r>
+      <w:r>
+        <w:br/>
+      </w:r>
+      <w:r>
+        <w:t xml:space="preserve">  "</w:t>
+      </w:r>
+      <w:proofErr w:type="spellStart"/>
+      <w:r>
+        <w:t>EventTypeId</w:t>
+      </w:r>
+      <w:proofErr w:type="spellEnd"/>
+      <w:r>
+        <w:t>": 1535,</w:t>
+      </w:r>
+      <w:r>
+        <w:br/>
+      </w:r>
+      <w:r>
+        <w:t xml:space="preserve">  "</w:t>
+      </w:r>
+      <w:proofErr w:type="spellStart"/>
+      <w:r>
+        <w:t>OtherEventType</w:t>
+      </w:r>
+      <w:proofErr w:type="spellEnd"/>
+      <w:r>
+        <w:t>": "User Value",</w:t>
+      </w:r>
+      <w:r>
+        <w:br/>
+      </w:r>
+      <w:r>
+        <w:t xml:space="preserve">  "</w:t>
+      </w:r>
+      <w:proofErr w:type="spellStart"/>
+      <w:r>
+        <w:t>HearingDateTime</w:t>
+      </w:r>
+      <w:proofErr w:type="spellEnd"/>
+      <w:r>
+        <w:t xml:space="preserve">": "2026-04-15 10:30:00",  </w:t>
+      </w:r>
+      <w:r>
+        <w:br/>
+      </w:r>
+      <w:r>
+        <w:t xml:space="preserve">  "Duration": 15,</w:t>
+      </w:r>
+      <w:r>
+        <w:br/>
+      </w:r>
+      <w:r>
+        <w:t xml:space="preserve">  "</w:t>
+      </w:r>
+      <w:proofErr w:type="spellStart"/>
+      <w:r>
+        <w:t>CourtRoomId</w:t>
+      </w:r>
+      <w:proofErr w:type="spellEnd"/>
+      <w:r>
+        <w:t xml:space="preserve">": 25,                     </w:t>
+      </w:r>
+      <w:r>
+        <w:br/>
+      </w:r>
+      <w:r>
+        <w:t xml:space="preserve">  "Notes": "REAL PROPERTY - DOCS COMPLETE",</w:t>
+      </w:r>
+      <w:r>
+        <w:br/>
+      </w:r>
+      <w:r>
+        <w:t xml:space="preserve">  "UDF": {</w:t>
+      </w:r>
+      <w:r>
+        <w:br/>
+      </w:r>
+      <w:r>
+        <w:t xml:space="preserve">    "Plaintiff": "Joe Terhune",</w:t>
+      </w:r>
+      <w:r>
+        <w:br/>
+      </w:r>
+      <w:r>
+        <w:t xml:space="preserve">    "Defendant": "Chris Schrieber",</w:t>
+      </w:r>
+      <w:r>
+        <w:br/>
+      </w:r>
+      <w:r>
+        <w:t xml:space="preserve">    "Interpreter Required": "no",</w:t>
+      </w:r>
+      <w:r>
+        <w:br/>
+      </w:r>
+      <w:r>
+        <w:t xml:space="preserve">    "Docket ID": "41"</w:t>
+      </w:r>
+      <w:r>
+        <w:br/>
+      </w:r>
+      <w:r>
+        <w:t xml:space="preserve">  }</w:t>
+      </w:r>
+      <w:r>
+        <w:br/>
+        <w:t>}</w:t>
+      </w:r>
+      <w:r>
+        <w:t>,</w:t>
+      </w:r>
+      <w:r>
+        <w:br/>
+      </w:r>
+      <w:r>
+        <w:t xml:space="preserve">  </w:t>
+      </w:r>
+      <w:r>
+        <w:t>"</w:t>
+      </w:r>
+      <w:r>
+        <w:t>CurrentEvent</w:t>
+      </w:r>
+      <w:r>
+        <w:t>": {</w:t>
+      </w:r>
+      <w:r>
+        <w:br/>
+      </w:r>
+      <w:r>
+        <w:t xml:space="preserve">    "</w:t>
+      </w:r>
+      <w:proofErr w:type="spellStart"/>
+      <w:r>
+        <w:t>HearingDateTime</w:t>
+      </w:r>
+      <w:proofErr w:type="spellEnd"/>
+      <w:r>
+        <w:t xml:space="preserve">": "2026-04-10 09:00:00", </w:t>
+      </w:r>
+      <w:r>
+        <w:br/>
+      </w:r>
+      <w:r>
+        <w:t xml:space="preserve">    "</w:t>
+      </w:r>
+      <w:proofErr w:type="spellStart"/>
+      <w:r>
+        <w:t>ClerkCourtRoomId</w:t>
+      </w:r>
+      <w:proofErr w:type="spellEnd"/>
+      <w:r>
+        <w:t xml:space="preserve">": 18,                      </w:t>
+      </w:r>
+      <w:r>
+        <w:br/>
+      </w:r>
+      <w:r>
+        <w:lastRenderedPageBreak/>
+        <w:t xml:space="preserve">    "Duration": 15,    </w:t>
+      </w:r>
+      <w:r>
+        <w:br/>
+      </w:r>
+      <w:r>
+        <w:t xml:space="preserve">    "</w:t>
+      </w:r>
+      <w:proofErr w:type="spellStart"/>
+      <w:r>
+        <w:t>ClerkJudgeId</w:t>
+      </w:r>
+      <w:proofErr w:type="spellEnd"/>
+      <w:r>
+        <w:t>": 154,</w:t>
+      </w:r>
+      <w:r>
+        <w:br/>
+      </w:r>
+      <w:r>
+        <w:t xml:space="preserve">    "</w:t>
+      </w:r>
+      <w:proofErr w:type="spellStart"/>
+      <w:r>
+        <w:t>ClerkEventTypeId</w:t>
+      </w:r>
+      <w:proofErr w:type="spellEnd"/>
+      <w:r>
+        <w:t>": 1535,</w:t>
+      </w:r>
+      <w:r>
+        <w:br/>
+      </w:r>
+      <w:r>
+        <w:t xml:space="preserve">    "Notes": "REAL PROPERTY - DOCS COMPLETE",</w:t>
+      </w:r>
+      <w:r>
+        <w:br/>
+      </w:r>
+      <w:r>
+        <w:t xml:space="preserve">    "UDF": {</w:t>
+      </w:r>
+      <w:r>
+        <w:br/>
+      </w:r>
+      <w:r>
+        <w:t xml:space="preserve">      "Plaintiff": "Joe Terhune",</w:t>
+      </w:r>
+      <w:r>
+        <w:br/>
+      </w:r>
+      <w:r>
+        <w:t xml:space="preserve">      "Defendant": "Chris Schrieber",</w:t>
+      </w:r>
+      <w:r>
+        <w:br/>
+      </w:r>
+      <w:r>
+        <w:t xml:space="preserve">      "Interpreter Required": "no",</w:t>
+      </w:r>
+      <w:r>
+        <w:br/>
+      </w:r>
+      <w:r>
+        <w:t xml:space="preserve">      "Docket ID": "41"</w:t>
+      </w:r>
+      <w:r>
+        <w:br/>
+      </w:r>
+      <w:r>
+        <w:t xml:space="preserve">    }</w:t>
+      </w:r>
+    </w:p>
+    <w:p>
+      <w:pPr>
+        <w:ind w:left="1440"/>
+      </w:pPr>
+      <w:r>
+        <w:t xml:space="preserve">  }</w:t>
+      </w:r>
+      <w:r>
+        <w:t>,</w:t>
+      </w:r>
+      <w:r>
+        <w:br/>
+      </w:r>
+      <w:r>
+        <w:t>"Reason": "Rescheduled to different day / Courtroom updated",</w:t>
+      </w:r>
+      <w:r>
+        <w:br/>
+        <w:t>}</w:t>
       </w:r>
     </w:p>
     <w:p>
       <w:pPr>
         <w:numPr>
           <w:ilvl w:val="0"/>
-          <w:numId w:val="7"/>
+          <w:numId w:val="5"/>
         </w:numPr>
       </w:pPr>
       <w:r>
@@ -1005,8 +1722,7 @@
           <w:b/>
           <w:bCs/>
         </w:rPr>
-        <w:lastRenderedPageBreak/>
-        <w:t>Request Body</w:t>
+        <w:t>Response</w:t>
       </w:r>
       <w:r>
         <w:t xml:space="preserve"> (JSON): </w:t>
@@ -1014,63 +1730,70 @@
     </w:p>
     <w:p>
       <w:pPr>
-        <w:ind w:left="1440"/>
-      </w:pPr>
-      <w:r>
-        <w:t>{</w:t>
-      </w:r>
-      <w:r>
-        <w:br/>
-      </w:r>
-      <w:r>
-        <w:t xml:space="preserve">  "</w:t>
+        <w:numPr>
+          <w:ilvl w:val="1"/>
+          <w:numId w:val="5"/>
+        </w:numPr>
+        <w:rPr>
+          <w:color w:val="3A7C22" w:themeColor="accent6" w:themeShade="BF"/>
+        </w:rPr>
+      </w:pPr>
+      <w:r>
+        <w:t>Success (</w:t>
+      </w:r>
+      <w:r>
+        <w:rPr>
+          <w:highlight w:val="yellow"/>
+        </w:rPr>
+        <w:t>201</w:t>
+      </w:r>
+      <w:r>
+        <w:t>): { "</w:t>
       </w:r>
       <w:proofErr w:type="spellStart"/>
       <w:r>
-        <w:t>HearingId</w:t>
+        <w:t>Event</w:t>
+      </w:r>
+      <w:r>
+        <w:t>Id</w:t>
       </w:r>
       <w:proofErr w:type="spellEnd"/>
       <w:r>
-        <w:t>": 123456,</w:t>
-      </w:r>
-      <w:r>
-        <w:br/>
-      </w:r>
-      <w:r>
-        <w:t xml:space="preserve">  "</w:t>
-      </w:r>
-      <w:proofErr w:type="spellStart"/>
-      <w:r>
-        <w:t>CancelReason</w:t>
-      </w:r>
-      <w:proofErr w:type="spellEnd"/>
-      <w:r>
-        <w:t>": "Update from Clerk System"</w:t>
-      </w:r>
-      <w:r>
-        <w:br/>
-      </w:r>
-      <w:r>
-        <w:t>}</w:t>
-      </w:r>
-    </w:p>
-    <w:p>
-      <w:pPr>
+        <w:t>": 123456</w:t>
+      </w:r>
+      <w:r>
+        <w:t xml:space="preserve">, </w:t>
+      </w:r>
+      <w:r>
+        <w:t>"error": "" }</w:t>
+      </w:r>
+      <w:r>
+        <w:t xml:space="preserve"> </w:t>
+      </w:r>
+    </w:p>
+    <w:p>
+      <w:pPr>
+        <w:numPr>
+          <w:ilvl w:val="1"/>
+          <w:numId w:val="5"/>
+        </w:numPr>
+      </w:pPr>
+      <w:r>
+        <w:t>Error (4xx/5xx): { "error": "Descriptive error message" }</w:t>
+      </w:r>
+    </w:p>
+    <w:p>
+      <w:pPr>
+        <w:pStyle w:val="ListParagraph"/>
         <w:numPr>
           <w:ilvl w:val="0"/>
-          <w:numId w:val="7"/>
+          <w:numId w:val="20"/>
         </w:numPr>
-      </w:pPr>
-      <w:r>
-        <w:rPr>
-          <w:b/>
-          <w:bCs/>
-        </w:rPr>
-        <w:t>Response</w:t>
-      </w:r>
-      <w:r>
-        <w:t>: Same as Create Hearing (200 OK on success).</w:t>
-      </w:r>
+        <w:rPr>
+          <w:b/>
+          <w:bCs/>
+        </w:rPr>
+      </w:pPr>
     </w:p>
     <w:p>
       <w:pPr>
@@ -1091,291 +1814,7 @@
           <w:b/>
           <w:bCs/>
         </w:rPr>
-        <w:t>4 Reschedule Hearing</w:t>
-      </w:r>
-    </w:p>
-    <w:p>
-      <w:pPr>
-        <w:numPr>
-          <w:ilvl w:val="0"/>
-          <w:numId w:val="8"/>
-        </w:numPr>
-      </w:pPr>
-      <w:r>
-        <w:rPr>
-          <w:b/>
-          <w:bCs/>
-        </w:rPr>
-        <w:t>Endpoint</w:t>
-      </w:r>
-      <w:r>
-        <w:t>: POST /</w:t>
-      </w:r>
-      <w:proofErr w:type="spellStart"/>
-      <w:r>
-        <w:t>rescheduleHearing</w:t>
-      </w:r>
-      <w:proofErr w:type="spellEnd"/>
-    </w:p>
-    <w:p>
-      <w:pPr>
-        <w:numPr>
-          <w:ilvl w:val="0"/>
-          <w:numId w:val="8"/>
-        </w:numPr>
-      </w:pPr>
-      <w:r>
-        <w:rPr>
-          <w:b/>
-          <w:bCs/>
-        </w:rPr>
-        <w:t>Description</w:t>
-      </w:r>
-      <w:r>
-        <w:t>: Reschedules a hearing by providing updated details (replaces old with new).</w:t>
-      </w:r>
-    </w:p>
-    <w:p>
-      <w:pPr>
-        <w:numPr>
-          <w:ilvl w:val="0"/>
-          <w:numId w:val="8"/>
-        </w:numPr>
-      </w:pPr>
-      <w:r>
-        <w:rPr>
-          <w:b/>
-          <w:bCs/>
-        </w:rPr>
-        <w:t>Request Body</w:t>
-      </w:r>
-      <w:r>
-        <w:t xml:space="preserve"> (JSON): </w:t>
-      </w:r>
-    </w:p>
-    <w:p>
-      <w:pPr>
-        <w:ind w:left="1440"/>
-      </w:pPr>
-      <w:r>
-        <w:t>{</w:t>
-      </w:r>
-      <w:r>
-        <w:br/>
-      </w:r>
-      <w:r>
-        <w:t xml:space="preserve">  "</w:t>
-      </w:r>
-      <w:proofErr w:type="spellStart"/>
-      <w:r>
-        <w:t>HearingId</w:t>
-      </w:r>
-      <w:proofErr w:type="spellEnd"/>
-      <w:r>
-        <w:t>": 123456,</w:t>
-      </w:r>
-      <w:r>
-        <w:br/>
-      </w:r>
-      <w:r>
-        <w:t xml:space="preserve">  "</w:t>
-      </w:r>
-      <w:proofErr w:type="spellStart"/>
-      <w:r>
-        <w:t>CourtName</w:t>
-      </w:r>
-      <w:proofErr w:type="spellEnd"/>
-      <w:r>
-        <w:t>": "CIRCUIT CIVIL DIV A, SARASOTA",</w:t>
-      </w:r>
-      <w:r>
-        <w:br/>
-      </w:r>
-      <w:r>
-        <w:t xml:space="preserve">  "</w:t>
-      </w:r>
-      <w:proofErr w:type="spellStart"/>
-      <w:r>
-        <w:t>JudgeId</w:t>
-      </w:r>
-      <w:proofErr w:type="spellEnd"/>
-      <w:r>
-        <w:t>": 154,</w:t>
-      </w:r>
-      <w:r>
-        <w:br/>
-      </w:r>
-      <w:r>
-        <w:t xml:space="preserve">  "Action": "Modify",</w:t>
-      </w:r>
-      <w:r>
-        <w:br/>
-      </w:r>
-      <w:r>
-        <w:t xml:space="preserve">  "</w:t>
-      </w:r>
-      <w:proofErr w:type="spellStart"/>
-      <w:r>
-        <w:t>MotionDesc</w:t>
-      </w:r>
-      <w:proofErr w:type="spellEnd"/>
-      <w:r>
-        <w:t>": "DISMISS",</w:t>
-      </w:r>
-      <w:r>
-        <w:br/>
-      </w:r>
-      <w:r>
-        <w:t xml:space="preserve">  "</w:t>
-      </w:r>
-      <w:proofErr w:type="spellStart"/>
-      <w:r>
-        <w:t>MotionOther</w:t>
-      </w:r>
-      <w:proofErr w:type="spellEnd"/>
-      <w:r>
-        <w:t>": null,</w:t>
-      </w:r>
-      <w:r>
-        <w:br/>
-      </w:r>
-      <w:r>
-        <w:t xml:space="preserve">  "</w:t>
-      </w:r>
-      <w:proofErr w:type="spellStart"/>
-      <w:r>
-        <w:t>HearingDate</w:t>
-      </w:r>
-      <w:proofErr w:type="spellEnd"/>
-      <w:r>
-        <w:t>": "2025-08-05",</w:t>
-      </w:r>
-      <w:r>
-        <w:br/>
-      </w:r>
-      <w:r>
-        <w:t xml:space="preserve">  "</w:t>
-      </w:r>
-      <w:proofErr w:type="spellStart"/>
-      <w:r>
-        <w:t>StartTime</w:t>
-      </w:r>
-      <w:proofErr w:type="spellEnd"/>
-      <w:r>
-        <w:t>": "1545",</w:t>
-      </w:r>
-      <w:r>
-        <w:br/>
-      </w:r>
-      <w:r>
-        <w:t xml:space="preserve">  "Duration": 15,</w:t>
-      </w:r>
-      <w:r>
-        <w:br/>
-      </w:r>
-      <w:r>
-        <w:t xml:space="preserve">  "</w:t>
-      </w:r>
-      <w:proofErr w:type="spellStart"/>
-      <w:r>
-        <w:t>CourtRoomId</w:t>
-      </w:r>
-      <w:proofErr w:type="spellEnd"/>
-      <w:r>
-        <w:t>": 25,</w:t>
-      </w:r>
-      <w:r>
-        <w:br/>
-      </w:r>
-      <w:r>
-        <w:t xml:space="preserve">  "</w:t>
-      </w:r>
-      <w:proofErr w:type="spellStart"/>
-      <w:r>
-        <w:t>HearingNotes</w:t>
-      </w:r>
-      <w:proofErr w:type="spellEnd"/>
-      <w:r>
-        <w:t>": "REAL PROPERTY - DOCS COMPLETE",</w:t>
-      </w:r>
-      <w:r>
-        <w:br/>
-      </w:r>
-      <w:r>
-        <w:t xml:space="preserve">  "</w:t>
-      </w:r>
-      <w:proofErr w:type="spellStart"/>
-      <w:r>
-        <w:t>CancelReason</w:t>
-      </w:r>
-      <w:proofErr w:type="spellEnd"/>
-      <w:r>
-        <w:t>": "Update from Clerk System"</w:t>
-      </w:r>
-      <w:r>
-        <w:br/>
-      </w:r>
-      <w:r>
-        <w:t>}</w:t>
-      </w:r>
-    </w:p>
-    <w:p>
-      <w:pPr>
-        <w:numPr>
-          <w:ilvl w:val="0"/>
-          <w:numId w:val="8"/>
-        </w:numPr>
-      </w:pPr>
-      <w:r>
-        <w:rPr>
-          <w:b/>
-          <w:bCs/>
-        </w:rPr>
-        <w:t>Response</w:t>
-      </w:r>
-      <w:r>
-        <w:t>: Same as Create Hearing (200 OK on success).</w:t>
-      </w:r>
-    </w:p>
-    <w:p>
-      <w:pPr>
-        <w:numPr>
-          <w:ilvl w:val="0"/>
-          <w:numId w:val="8"/>
-        </w:numPr>
-      </w:pPr>
-      <w:r>
-        <w:rPr>
-          <w:b/>
-          <w:bCs/>
-        </w:rPr>
-        <w:t>Notes</w:t>
-      </w:r>
-      <w:r>
-        <w:t xml:space="preserve">: This endpoint handles the "old" vs. "new" logic internally by updating based on </w:t>
-      </w:r>
-      <w:proofErr w:type="spellStart"/>
-      <w:r>
-        <w:t>HearingId</w:t>
-      </w:r>
-      <w:proofErr w:type="spellEnd"/>
-      <w:r>
-        <w:t>.</w:t>
-      </w:r>
-    </w:p>
-    <w:p>
-      <w:pPr>
-        <w:rPr>
-          <w:b/>
-          <w:bCs/>
-        </w:rPr>
-      </w:pPr>
-      <w:r>
-        <w:rPr>
-          <w:b/>
-          <w:bCs/>
-        </w:rPr>
-        <w:t>1.5</w:t>
+        <w:t>5</w:t>
       </w:r>
       <w:r>
         <w:rPr>
@@ -1478,13 +1917,10 @@
         <w:ind w:left="1440"/>
       </w:pPr>
       <w:r>
-        <w:lastRenderedPageBreak/>
         <w:t>{</w:t>
       </w:r>
       <w:r>
         <w:br/>
-      </w:r>
-      <w:r>
         <w:t xml:space="preserve">  "</w:t>
       </w:r>
       <w:proofErr w:type="spellStart"/>
@@ -1493,20 +1929,10 @@
       </w:r>
       <w:proofErr w:type="spellEnd"/>
       <w:r>
-        <w:t xml:space="preserve">": </w:t>
-      </w:r>
-      <w:proofErr w:type="gramStart"/>
-      <w:r>
-        <w:t xml:space="preserve">12345,   </w:t>
-      </w:r>
-      <w:proofErr w:type="gramEnd"/>
-      <w:r>
-        <w:t xml:space="preserve">    </w:t>
-      </w:r>
-      <w:r>
-        <w:br/>
-      </w:r>
-      <w:r>
+        <w:t xml:space="preserve">": 12345,       </w:t>
+      </w:r>
+      <w:r>
+        <w:br/>
         <w:t xml:space="preserve">  "</w:t>
       </w:r>
       <w:proofErr w:type="spellStart"/>
@@ -1519,10 +1945,7 @@
       </w:r>
       <w:r>
         <w:br/>
-        <w:t xml:space="preserve">  </w:t>
-      </w:r>
-      <w:r>
-        <w:t>"</w:t>
+        <w:t xml:space="preserve">  "</w:t>
       </w:r>
       <w:proofErr w:type="spellStart"/>
       <w:r>
@@ -1534,13 +1957,14 @@
       </w:r>
       <w:r>
         <w:br/>
-      </w:r>
-      <w:r>
         <w:t xml:space="preserve">  "</w:t>
       </w:r>
       <w:proofErr w:type="spellStart"/>
       <w:r>
-        <w:t>RequestorName</w:t>
+        <w:t>Requestor</w:t>
+      </w:r>
+      <w:r>
+        <w:t>Email</w:t>
       </w:r>
       <w:proofErr w:type="spellEnd"/>
       <w:r>
@@ -1548,8 +1972,6 @@
       </w:r>
       <w:r>
         <w:br/>
-      </w:r>
-      <w:r>
         <w:t xml:space="preserve">  "</w:t>
       </w:r>
       <w:proofErr w:type="spellStart"/>
@@ -1570,8 +1992,6 @@
       </w:r>
       <w:r>
         <w:br/>
-      </w:r>
-      <w:r>
         <w:t>}</w:t>
       </w:r>
     </w:p>
@@ -1579,7 +1999,7 @@
       <w:pPr>
         <w:numPr>
           <w:ilvl w:val="0"/>
-          <w:numId w:val="11"/>
+          <w:numId w:val="5"/>
         </w:numPr>
       </w:pPr>
       <w:r>
@@ -1590,28 +2010,36 @@
         <w:t>Response</w:t>
       </w:r>
       <w:r>
-        <w:t xml:space="preserve"> (JSON, 200 OK): </w:t>
-      </w:r>
-      <w:r>
-        <w:rPr>
-          <w:i/>
-          <w:iCs/>
-        </w:rPr>
-        <w:t>(This could be multiple cases if searching by case</w:t>
-      </w:r>
-      <w:r>
-        <w:rPr>
-          <w:i/>
-          <w:iCs/>
-        </w:rPr>
+        <w:t xml:space="preserve"> (JSON): </w:t>
+      </w:r>
+    </w:p>
+    <w:p>
+      <w:pPr>
+        <w:numPr>
+          <w:ilvl w:val="1"/>
+          <w:numId w:val="5"/>
+        </w:numPr>
+      </w:pPr>
+      <w:r>
+        <w:t>Success (</w:t>
+      </w:r>
+      <w:r>
+        <w:rPr>
+          <w:highlight w:val="yellow"/>
+        </w:rPr>
+        <w:t>200</w:t>
+      </w:r>
+      <w:r>
+        <w:t>)</w:t>
+      </w:r>
+      <w:r>
         <w:t xml:space="preserve"> </w:t>
       </w:r>
       <w:r>
         <w:rPr>
-          <w:i/>
-          <w:iCs/>
-        </w:rPr>
-        <w:t>number. Do we want a separate endpoint for case id vs case number search?)</w:t>
+          <w:color w:val="3A7C22" w:themeColor="accent6" w:themeShade="BF"/>
+        </w:rPr>
+        <w:t>:</w:t>
       </w:r>
     </w:p>
     <w:p>
@@ -1631,6 +2059,7 @@
         <w:br/>
       </w:r>
       <w:r>
+        <w:lastRenderedPageBreak/>
         <w:t xml:space="preserve">    "</w:t>
       </w:r>
       <w:proofErr w:type="spellStart"/>
@@ -1756,6 +2185,17 @@
       </w:r>
       <w:r>
         <w:t>]</w:t>
+      </w:r>
+    </w:p>
+    <w:p>
+      <w:pPr>
+        <w:numPr>
+          <w:ilvl w:val="1"/>
+          <w:numId w:val="5"/>
+        </w:numPr>
+      </w:pPr>
+      <w:r>
+        <w:t>Error (4xx/5xx): { "error": "Descriptive error message" }</w:t>
       </w:r>
     </w:p>
     <w:p>
@@ -1823,28 +2263,41 @@
         <w:t>requesting case info for an existing hearing.</w:t>
       </w:r>
       <w:r>
+        <w:t xml:space="preserve"> Response may be multiple </w:t>
+      </w:r>
+      <w:r>
+        <w:t>records depending o</w:t>
+      </w:r>
+      <w:r>
+        <w:t>n whether or not a partial case number is provided. For example a case with multiple defendants</w:t>
+      </w:r>
+      <w:r>
+        <w:t xml:space="preserve"> will return records for all defendants if that information is not provided in the case number provided.</w:t>
+      </w:r>
+      <w:r>
         <w:t xml:space="preserve"> </w:t>
       </w:r>
       <w:r>
         <w:rPr>
           <w:color w:val="C00000"/>
         </w:rPr>
-        <w:t xml:space="preserve">Don’t know if we need telephone </w:t>
-      </w:r>
-      <w:proofErr w:type="gramStart"/>
+        <w:t>Don’t know if we need telephone number.</w:t>
+      </w:r>
       <w:r>
         <w:rPr>
           <w:color w:val="C00000"/>
         </w:rPr>
-        <w:t>number</w:t>
-      </w:r>
-      <w:proofErr w:type="gramEnd"/>
-      <w:r>
-        <w:rPr>
-          <w:color w:val="C00000"/>
-        </w:rPr>
-        <w:t>.</w:t>
-      </w:r>
+        <w:t xml:space="preserve"> </w:t>
+      </w:r>
+    </w:p>
+    <w:p>
+      <w:pPr>
+        <w:pStyle w:val="ListParagraph"/>
+        <w:rPr>
+          <w:b/>
+          <w:bCs/>
+        </w:rPr>
+      </w:pPr>
     </w:p>
     <w:p>
       <w:pPr>
@@ -1934,7 +2387,7 @@
         <w:t>get</w:t>
       </w:r>
       <w:r>
-        <w:t>Hearing</w:t>
+        <w:t>Event</w:t>
       </w:r>
       <w:proofErr w:type="spellEnd"/>
     </w:p>
@@ -1990,12 +2443,14 @@
         <w:ind w:left="1440"/>
       </w:pPr>
       <w:r>
-        <w:lastRenderedPageBreak/>
         <w:t xml:space="preserve">  "</w:t>
       </w:r>
       <w:proofErr w:type="spellStart"/>
       <w:r>
-        <w:t>HearingId</w:t>
+        <w:t>Event</w:t>
+      </w:r>
+      <w:r>
+        <w:t>Id</w:t>
       </w:r>
       <w:proofErr w:type="spellEnd"/>
       <w:r>
@@ -2041,355 +2496,203 @@
     </w:p>
     <w:p>
       <w:pPr>
-        <w:ind w:left="1440"/>
-        <w:rPr>
-          <w:i/>
-          <w:iCs/>
-        </w:rPr>
-      </w:pPr>
+        <w:ind w:left="1080" w:firstLine="360"/>
+      </w:pPr>
+      <w:r>
+        <w:lastRenderedPageBreak/>
+        <w:t xml:space="preserve">  </w:t>
+      </w:r>
+      <w:r>
+        <w:t>"</w:t>
+      </w:r>
+      <w:proofErr w:type="spellStart"/>
+      <w:r>
+        <w:t>CaseId</w:t>
+      </w:r>
+      <w:proofErr w:type="spellEnd"/>
+      <w:r>
+        <w:t>": 12345,</w:t>
+      </w:r>
+      <w:r>
+        <w:br/>
+      </w:r>
+      <w:r>
+        <w:t xml:space="preserve">  </w:t>
+      </w:r>
+      <w:r>
+        <w:tab/>
+        <w:t xml:space="preserve">  </w:t>
+      </w:r>
+      <w:r>
+        <w:t>"</w:t>
+      </w:r>
+      <w:proofErr w:type="spellStart"/>
+      <w:r>
+        <w:t>JudgeId</w:t>
+      </w:r>
+      <w:proofErr w:type="spellEnd"/>
+      <w:r>
+        <w:t>": 154,</w:t>
+      </w:r>
+      <w:r>
+        <w:t xml:space="preserve">  </w:t>
+      </w:r>
+      <w:r>
+        <w:br/>
+      </w:r>
+      <w:r>
+        <w:t xml:space="preserve">  </w:t>
+      </w:r>
+      <w:r>
+        <w:tab/>
+        <w:t xml:space="preserve">  </w:t>
+      </w:r>
+      <w:r>
+        <w:t>"</w:t>
+      </w:r>
+      <w:proofErr w:type="spellStart"/>
+      <w:r>
+        <w:t>EventTypeId</w:t>
+      </w:r>
+      <w:proofErr w:type="spellEnd"/>
+      <w:r>
+        <w:t xml:space="preserve">": </w:t>
+      </w:r>
+      <w:r>
+        <w:t>1535,</w:t>
+      </w:r>
+      <w:r>
+        <w:br/>
+      </w:r>
+      <w:r>
+        <w:t xml:space="preserve">  </w:t>
+      </w:r>
+      <w:r>
+        <w:tab/>
+        <w:t xml:space="preserve">  </w:t>
+      </w:r>
+      <w:r>
+        <w:t>"</w:t>
+      </w:r>
+      <w:proofErr w:type="spellStart"/>
+      <w:r>
+        <w:t>Other</w:t>
+      </w:r>
+      <w:r>
+        <w:t>EventType</w:t>
+      </w:r>
+      <w:proofErr w:type="spellEnd"/>
+      <w:r>
+        <w:t>": "User Value",</w:t>
+      </w:r>
+      <w:r>
+        <w:br/>
+      </w:r>
+      <w:r>
+        <w:t xml:space="preserve">  </w:t>
+      </w:r>
+      <w:r>
+        <w:tab/>
+        <w:t xml:space="preserve">  </w:t>
+      </w:r>
+      <w:r>
+        <w:t>"</w:t>
+      </w:r>
+      <w:proofErr w:type="spellStart"/>
+      <w:r>
+        <w:t>Event</w:t>
+      </w:r>
+      <w:r>
+        <w:t>Date</w:t>
+      </w:r>
+      <w:r>
+        <w:t>Time</w:t>
+      </w:r>
+      <w:proofErr w:type="spellEnd"/>
+      <w:r>
+        <w:t>": "</w:t>
+      </w:r>
+      <w:proofErr w:type="spellStart"/>
+      <w:r>
+        <w:t>yyyy</w:t>
+      </w:r>
+      <w:proofErr w:type="spellEnd"/>
+      <w:r>
+        <w:t>-</w:t>
+      </w:r>
+      <w:r>
+        <w:t>mm</w:t>
+      </w:r>
+      <w:r>
+        <w:t>-</w:t>
+      </w:r>
+      <w:r>
+        <w:t xml:space="preserve">dd </w:t>
+      </w:r>
+      <w:proofErr w:type="spellStart"/>
+      <w:r>
+        <w:t>hh:mm:ss</w:t>
+      </w:r>
+      <w:proofErr w:type="spellEnd"/>
+      <w:r>
+        <w:t>",</w:t>
+      </w:r>
       <w:r>
         <w:t xml:space="preserve"> </w:t>
       </w:r>
       <w:r>
-        <w:t xml:space="preserve"> </w:t>
+        <w:br/>
+      </w:r>
+      <w:r>
+        <w:t xml:space="preserve">  </w:t>
+      </w:r>
+      <w:r>
+        <w:tab/>
+        <w:t xml:space="preserve">  </w:t>
+      </w:r>
+      <w:r>
+        <w:t>"Duration": 15,</w:t>
+      </w:r>
+      <w:r>
+        <w:br/>
+      </w:r>
+      <w:r>
+        <w:t xml:space="preserve">  </w:t>
+      </w:r>
+      <w:r>
+        <w:tab/>
+        <w:t xml:space="preserve">  </w:t>
       </w:r>
       <w:r>
         <w:t>"</w:t>
       </w:r>
       <w:proofErr w:type="spellStart"/>
       <w:r>
-        <w:t>Case</w:t>
-      </w:r>
-      <w:r>
-        <w:t>N</w:t>
-      </w:r>
-      <w:r>
-        <w:t>umber</w:t>
+        <w:t>CourtRoomId</w:t>
       </w:r>
       <w:proofErr w:type="spellEnd"/>
       <w:r>
-        <w:t xml:space="preserve">": "58-2025-SC-006484-XXXA-SC",  </w:t>
-      </w:r>
-      <w:r>
-        <w:rPr>
-          <w:i/>
-          <w:iCs/>
-        </w:rPr>
+        <w:t>": 25,</w:t>
+      </w:r>
+      <w:r>
         <w:br/>
       </w:r>
       <w:r>
         <w:t xml:space="preserve">  </w:t>
       </w:r>
       <w:r>
-        <w:t>"Petitioner": "LAST, FIRST OR BUSINESS NAME</w:t>
-      </w:r>
-      <w:r>
-        <w:t>",</w:t>
-      </w:r>
-      <w:r>
-        <w:rPr>
-          <w:i/>
-          <w:iCs/>
-        </w:rPr>
-        <w:t xml:space="preserve"> </w:t>
-      </w:r>
-      <w:r>
-        <w:rPr>
-          <w:i/>
-          <w:iCs/>
-        </w:rPr>
-        <w:br/>
-      </w:r>
-      <w:r>
-        <w:t xml:space="preserve">  "</w:t>
-      </w:r>
-      <w:proofErr w:type="spellStart"/>
-      <w:r>
-        <w:t>PetitionerAttyBar</w:t>
-      </w:r>
-      <w:proofErr w:type="spellEnd"/>
-      <w:r>
-        <w:t xml:space="preserve">": "FL BAR NUMBER",      </w:t>
-      </w:r>
-      <w:r>
-        <w:rPr>
-          <w:i/>
-          <w:iCs/>
-        </w:rPr>
-        <w:br/>
-      </w:r>
-      <w:r>
-        <w:t xml:space="preserve">  "Respondent": "LAST, FIRST OR BUSINESS NAME",  </w:t>
-      </w:r>
-      <w:r>
-        <w:rPr>
-          <w:i/>
-          <w:iCs/>
-        </w:rPr>
-        <w:br/>
-      </w:r>
-      <w:r>
-        <w:t xml:space="preserve">  "</w:t>
-      </w:r>
-      <w:proofErr w:type="spellStart"/>
-      <w:r>
-        <w:t>RespondentAttyBar</w:t>
-      </w:r>
-      <w:proofErr w:type="spellEnd"/>
-      <w:r>
-        <w:t xml:space="preserve">": "FL BAR NUMBER",      </w:t>
-      </w:r>
-      <w:r>
-        <w:rPr>
-          <w:i/>
-          <w:iCs/>
-        </w:rPr>
-        <w:t xml:space="preserve"> </w:t>
-      </w:r>
-      <w:r>
-        <w:rPr>
-          <w:i/>
-          <w:iCs/>
-        </w:rPr>
-        <w:br/>
-      </w:r>
-      <w:r>
-        <w:t xml:space="preserve">  "</w:t>
-      </w:r>
-      <w:proofErr w:type="spellStart"/>
-      <w:r>
-        <w:t>CaseId</w:t>
-      </w:r>
-      <w:proofErr w:type="spellEnd"/>
-      <w:r>
-        <w:t xml:space="preserve">": 12345,                          </w:t>
-      </w:r>
-      <w:r>
-        <w:rPr>
-          <w:i/>
-          <w:iCs/>
-        </w:rPr>
-        <w:br/>
-      </w:r>
-      <w:r>
-        <w:t xml:space="preserve">  "</w:t>
-      </w:r>
-      <w:proofErr w:type="spellStart"/>
-      <w:r>
-        <w:t>CourtName</w:t>
-      </w:r>
-      <w:proofErr w:type="spellEnd"/>
-      <w:r>
-        <w:t xml:space="preserve">": "CIRCUIT CIVIL DIV A, SARASOTA",  </w:t>
-      </w:r>
-      <w:r>
-        <w:rPr>
-          <w:i/>
-          <w:iCs/>
-        </w:rPr>
-        <w:br/>
-      </w:r>
-      <w:r>
-        <w:t xml:space="preserve">  "</w:t>
-      </w:r>
-      <w:proofErr w:type="spellStart"/>
-      <w:r>
-        <w:t>Judge</w:t>
-      </w:r>
-      <w:r>
-        <w:t>Id</w:t>
-      </w:r>
-      <w:proofErr w:type="spellEnd"/>
-      <w:r>
-        <w:t xml:space="preserve">": </w:t>
-      </w:r>
-      <w:r>
-        <w:t>1548</w:t>
-      </w:r>
-      <w:r>
-        <w:t xml:space="preserve">,  </w:t>
-      </w:r>
-      <w:r>
-        <w:rPr>
-          <w:i/>
-          <w:iCs/>
-          <w:color w:val="124F1A" w:themeColor="accent3" w:themeShade="BF"/>
-        </w:rPr>
-        <w:t xml:space="preserve">// </w:t>
-      </w:r>
-      <w:r>
-        <w:rPr>
-          <w:i/>
-          <w:iCs/>
-          <w:color w:val="124F1A" w:themeColor="accent3" w:themeShade="BF"/>
-        </w:rPr>
-        <w:t>clerk judge ID</w:t>
-      </w:r>
-      <w:r>
-        <w:rPr>
-          <w:i/>
-          <w:iCs/>
-        </w:rPr>
-        <w:br/>
-      </w:r>
-      <w:r>
-        <w:t xml:space="preserve">  "Action": "New",                          </w:t>
-      </w:r>
-      <w:r>
-        <w:rPr>
-          <w:i/>
-          <w:iCs/>
-        </w:rPr>
-        <w:br/>
-      </w:r>
-      <w:r>
-        <w:t xml:space="preserve">  "</w:t>
-      </w:r>
-      <w:proofErr w:type="spellStart"/>
-      <w:r>
-        <w:t>MotionDesc</w:t>
-      </w:r>
-      <w:proofErr w:type="spellEnd"/>
-      <w:r>
-        <w:t xml:space="preserve">": "DISMISS",                  </w:t>
-      </w:r>
-      <w:r>
-        <w:rPr>
-          <w:i/>
-          <w:iCs/>
-        </w:rPr>
-        <w:br/>
-      </w:r>
-      <w:r>
-        <w:t xml:space="preserve">  "</w:t>
-      </w:r>
-      <w:proofErr w:type="spellStart"/>
-      <w:r>
-        <w:t>MotionOther</w:t>
-      </w:r>
-      <w:proofErr w:type="spellEnd"/>
-      <w:r>
-        <w:t xml:space="preserve">": "User Value",               </w:t>
-      </w:r>
-      <w:r>
-        <w:rPr>
-          <w:i/>
-          <w:iCs/>
-        </w:rPr>
-        <w:br/>
-      </w:r>
-      <w:r>
-        <w:t xml:space="preserve">  "</w:t>
-      </w:r>
-      <w:proofErr w:type="spellStart"/>
-      <w:r>
-        <w:t>HearingDate</w:t>
-      </w:r>
-      <w:proofErr w:type="spellEnd"/>
-      <w:r>
-        <w:t xml:space="preserve">": "2025-08-05",               </w:t>
-      </w:r>
-      <w:r>
-        <w:rPr>
-          <w:i/>
-          <w:iCs/>
-        </w:rPr>
-        <w:br/>
-      </w:r>
-      <w:r>
-        <w:t xml:space="preserve">  "</w:t>
-      </w:r>
-      <w:proofErr w:type="spellStart"/>
-      <w:r>
-        <w:t>StartTime</w:t>
-      </w:r>
-      <w:proofErr w:type="spellEnd"/>
-      <w:r>
-        <w:t xml:space="preserve">": "1545",                       </w:t>
-      </w:r>
-      <w:r>
-        <w:rPr>
-          <w:i/>
-          <w:iCs/>
-        </w:rPr>
-        <w:br/>
-      </w:r>
-      <w:r>
-        <w:t xml:space="preserve">  "Duration": 15,                            </w:t>
-      </w:r>
-      <w:r>
-        <w:rPr>
-          <w:i/>
-          <w:iCs/>
-        </w:rPr>
-        <w:br/>
-      </w:r>
-      <w:r>
-        <w:t xml:space="preserve">  "</w:t>
-      </w:r>
-      <w:proofErr w:type="spellStart"/>
-      <w:r>
-        <w:t>CourtRoom</w:t>
-      </w:r>
-      <w:r>
-        <w:t>Id</w:t>
-      </w:r>
-      <w:proofErr w:type="spellEnd"/>
-      <w:r>
-        <w:t xml:space="preserve">": </w:t>
-      </w:r>
-      <w:r>
-        <w:t>25</w:t>
-      </w:r>
-      <w:r>
-        <w:t xml:space="preserve">, </w:t>
-      </w:r>
-      <w:r>
-        <w:rPr>
-          <w:i/>
-          <w:iCs/>
-          <w:color w:val="124F1A" w:themeColor="accent3" w:themeShade="BF"/>
-        </w:rPr>
-        <w:t xml:space="preserve">// </w:t>
-      </w:r>
-      <w:r>
-        <w:rPr>
-          <w:i/>
-          <w:iCs/>
-          <w:color w:val="124F1A" w:themeColor="accent3" w:themeShade="BF"/>
-        </w:rPr>
-        <w:t>clerk courtroom ID</w:t>
-      </w:r>
-      <w:r>
-        <w:rPr>
-          <w:i/>
-          <w:iCs/>
-        </w:rPr>
-        <w:br/>
-      </w:r>
-      <w:r>
-        <w:t xml:space="preserve">  "</w:t>
-      </w:r>
-      <w:proofErr w:type="spellStart"/>
-      <w:r>
-        <w:t>HearingNotes</w:t>
-      </w:r>
-      <w:proofErr w:type="spellEnd"/>
-      <w:r>
-        <w:t xml:space="preserve">": "REAL PROPERTY - DOCS COMPLETE"  </w:t>
-      </w:r>
-      <w:r>
-        <w:rPr>
-          <w:i/>
-          <w:iCs/>
-        </w:rPr>
-        <w:t>// string, optional</w:t>
-      </w:r>
-    </w:p>
-    <w:p>
-      <w:pPr>
-        <w:ind w:left="1080" w:firstLine="360"/>
-      </w:pPr>
+        <w:tab/>
+        <w:t xml:space="preserve">  </w:t>
+      </w:r>
+      <w:r>
+        <w:t>"Notes": "REAL PROPERTY - DOCS COMPLETE",</w:t>
+      </w:r>
+      <w:r>
+        <w:br/>
+      </w:r>
+      <w:r>
+        <w:t xml:space="preserve">       </w:t>
+      </w:r>
       <w:r>
         <w:t>}</w:t>
       </w:r>
@@ -2425,20 +2728,7 @@
         </w:numPr>
       </w:pPr>
       <w:r>
-        <w:t xml:space="preserve">Error (4xx/5xx): </w:t>
-      </w:r>
-      <w:proofErr w:type="gramStart"/>
-      <w:r>
-        <w:t>{ "</w:t>
-      </w:r>
-      <w:proofErr w:type="spellStart"/>
-      <w:proofErr w:type="gramEnd"/>
-      <w:r>
-        <w:t>errorMsg</w:t>
-      </w:r>
-      <w:proofErr w:type="spellEnd"/>
-      <w:r>
-        <w:t>": "Descriptive error message" }</w:t>
+        <w:t>Error (4xx/5xx): { "error": "Descriptive error message" }</w:t>
       </w:r>
     </w:p>
     <w:p>
@@ -2606,14 +2896,11 @@
       </w:r>
       <w:r>
         <w:br/>
-        <w:t xml:space="preserve">  </w:t>
-      </w:r>
-      <w:r>
-        <w:t>{ "</w:t>
+        <w:t xml:space="preserve">  { "</w:t>
       </w:r>
       <w:proofErr w:type="spellStart"/>
       <w:r>
-        <w:t>CourtRoomId</w:t>
+        <w:t>JudgeId</w:t>
       </w:r>
       <w:proofErr w:type="spellEnd"/>
       <w:r>
@@ -2621,47 +2908,55 @@
       </w:r>
       <w:proofErr w:type="spellStart"/>
       <w:r>
-        <w:t>CourtroomName</w:t>
+        <w:t>Judge</w:t>
+      </w:r>
+      <w:r>
+        <w:t>Name</w:t>
       </w:r>
       <w:proofErr w:type="spellEnd"/>
       <w:r>
-        <w:t>": "2A</w:t>
-      </w:r>
-      <w:proofErr w:type="gramStart"/>
+        <w:t>": "</w:t>
+      </w:r>
+      <w:r>
+        <w:t>John Williams</w:t>
+      </w:r>
+      <w:r>
+        <w:t xml:space="preserve">" }, </w:t>
+      </w:r>
+      <w:r>
+        <w:br/>
+        <w:t xml:space="preserve">  { "</w:t>
+      </w:r>
+      <w:proofErr w:type="spellStart"/>
+      <w:r>
+        <w:t>Judge</w:t>
+      </w:r>
+      <w:r>
+        <w:t>Id</w:t>
+      </w:r>
+      <w:proofErr w:type="spellEnd"/>
+      <w:r>
+        <w:t>": 2, "</w:t>
+      </w:r>
+      <w:proofErr w:type="spellStart"/>
+      <w:r>
+        <w:t>Judge</w:t>
+      </w:r>
+      <w:r>
+        <w:t>Name</w:t>
+      </w:r>
+      <w:proofErr w:type="spellEnd"/>
+      <w:r>
+        <w:t>": "</w:t>
+      </w:r>
+      <w:r>
+        <w:t>James Brown Jr.</w:t>
+      </w:r>
       <w:r>
         <w:t>" }</w:t>
       </w:r>
-      <w:proofErr w:type="gramEnd"/>
-      <w:r>
-        <w:t xml:space="preserve">, </w:t>
-      </w:r>
-      <w:r>
-        <w:br/>
-        <w:t xml:space="preserve"> </w:t>
-      </w:r>
-      <w:r>
-        <w:t xml:space="preserve"> { "</w:t>
-      </w:r>
-      <w:proofErr w:type="spellStart"/>
-      <w:r>
-        <w:t>CourtRoomId</w:t>
-      </w:r>
-      <w:proofErr w:type="spellEnd"/>
-      <w:r>
-        <w:t>": 2, "</w:t>
-      </w:r>
-      <w:proofErr w:type="spellStart"/>
-      <w:r>
-        <w:t>CourtroomName</w:t>
-      </w:r>
-      <w:proofErr w:type="spellEnd"/>
-      <w:r>
-        <w:t>": "3B" }</w:t>
-      </w:r>
-      <w:r>
-        <w:br/>
-      </w:r>
-      <w:r>
+      <w:r>
+        <w:br/>
         <w:t>]</w:t>
       </w:r>
     </w:p>
@@ -2673,7 +2968,6 @@
         </w:numPr>
       </w:pPr>
       <w:r>
-        <w:lastRenderedPageBreak/>
         <w:t>Success (20</w:t>
       </w:r>
       <w:r>
@@ -2697,20 +2991,7 @@
         </w:numPr>
       </w:pPr>
       <w:r>
-        <w:t xml:space="preserve">Error (4xx/5xx): </w:t>
-      </w:r>
-      <w:proofErr w:type="gramStart"/>
-      <w:r>
-        <w:t>{ "</w:t>
-      </w:r>
-      <w:proofErr w:type="spellStart"/>
-      <w:proofErr w:type="gramEnd"/>
-      <w:r>
-        <w:t>errorMsg</w:t>
-      </w:r>
-      <w:proofErr w:type="spellEnd"/>
-      <w:r>
-        <w:t>": "Descriptive error message" }</w:t>
+        <w:t>Error (4xx/5xx): { "error": "Descriptive error message" }</w:t>
       </w:r>
     </w:p>
     <w:p>
@@ -2884,20 +3165,13 @@
       </w:r>
       <w:r>
         <w:br/>
-      </w:r>
-      <w:r>
         <w:t xml:space="preserve"> </w:t>
       </w:r>
-      <w:proofErr w:type="gramStart"/>
       <w:r>
         <w:t xml:space="preserve">  </w:t>
       </w:r>
       <w:r>
-        <w:t xml:space="preserve"> {</w:t>
-      </w:r>
-      <w:proofErr w:type="gramEnd"/>
-      <w:r>
-        <w:t xml:space="preserve"> "</w:t>
+        <w:t xml:space="preserve"> { "</w:t>
       </w:r>
       <w:proofErr w:type="spellStart"/>
       <w:r>
@@ -2913,26 +3187,19 @@
       </w:r>
       <w:proofErr w:type="spellEnd"/>
       <w:r>
-        <w:t>": "2</w:t>
-      </w:r>
-      <w:proofErr w:type="gramStart"/>
-      <w:r>
-        <w:t>A"</w:t>
+        <w:t>": "2A"</w:t>
       </w:r>
       <w:r>
         <w:t xml:space="preserve"> </w:t>
       </w:r>
       <w:r>
-        <w:t>}</w:t>
-      </w:r>
-      <w:proofErr w:type="gramEnd"/>
-      <w:r>
-        <w:t>,</w:t>
-      </w:r>
-      <w:r>
-        <w:br/>
-      </w:r>
-      <w:r>
+        <w:t>},</w:t>
+      </w:r>
+      <w:r>
+        <w:br/>
+      </w:r>
+      <w:r>
+        <w:lastRenderedPageBreak/>
         <w:t xml:space="preserve"> </w:t>
       </w:r>
       <w:r>
@@ -3004,20 +3271,304 @@
         </w:numPr>
       </w:pPr>
       <w:r>
-        <w:t xml:space="preserve">Error (4xx/5xx): </w:t>
-      </w:r>
-      <w:proofErr w:type="gramStart"/>
-      <w:r>
-        <w:t>{ "</w:t>
+        <w:t>Error (4xx/5xx): { "</w:t>
       </w:r>
       <w:proofErr w:type="spellStart"/>
-      <w:proofErr w:type="gramEnd"/>
       <w:r>
         <w:t>errorMsg</w:t>
       </w:r>
       <w:proofErr w:type="spellEnd"/>
       <w:r>
         <w:t>": "Descriptive error message" }</w:t>
+      </w:r>
+    </w:p>
+    <w:p>
+      <w:pPr>
+        <w:rPr>
+          <w:b/>
+          <w:bCs/>
+        </w:rPr>
+      </w:pPr>
+      <w:r>
+        <w:rPr>
+          <w:b/>
+          <w:bCs/>
+        </w:rPr>
+        <w:t>2</w:t>
+      </w:r>
+      <w:r>
+        <w:rPr>
+          <w:b/>
+          <w:bCs/>
+        </w:rPr>
+        <w:t>.</w:t>
+      </w:r>
+      <w:r>
+        <w:rPr>
+          <w:b/>
+          <w:bCs/>
+        </w:rPr>
+        <w:t>3</w:t>
+      </w:r>
+      <w:r>
+        <w:rPr>
+          <w:b/>
+          <w:bCs/>
+        </w:rPr>
+        <w:t xml:space="preserve"> </w:t>
+      </w:r>
+      <w:r>
+        <w:rPr>
+          <w:b/>
+          <w:bCs/>
+        </w:rPr>
+        <w:t>Retrieve</w:t>
+      </w:r>
+      <w:r>
+        <w:rPr>
+          <w:b/>
+          <w:bCs/>
+        </w:rPr>
+        <w:t xml:space="preserve"> </w:t>
+      </w:r>
+      <w:r>
+        <w:rPr>
+          <w:b/>
+          <w:bCs/>
+        </w:rPr>
+        <w:t>Event Types (Motions)</w:t>
+      </w:r>
+    </w:p>
+    <w:p>
+      <w:pPr>
+        <w:numPr>
+          <w:ilvl w:val="0"/>
+          <w:numId w:val="5"/>
+        </w:numPr>
+      </w:pPr>
+      <w:r>
+        <w:rPr>
+          <w:b/>
+          <w:bCs/>
+        </w:rPr>
+        <w:t>Endpoint</w:t>
+      </w:r>
+      <w:r>
+        <w:t xml:space="preserve">: </w:t>
+      </w:r>
+      <w:r>
+        <w:t>GET</w:t>
+      </w:r>
+      <w:r>
+        <w:t xml:space="preserve"> /</w:t>
+      </w:r>
+      <w:proofErr w:type="spellStart"/>
+      <w:r>
+        <w:t>get</w:t>
+      </w:r>
+      <w:r>
+        <w:t>EventTypes</w:t>
+      </w:r>
+      <w:proofErr w:type="spellEnd"/>
+    </w:p>
+    <w:p>
+      <w:pPr>
+        <w:numPr>
+          <w:ilvl w:val="0"/>
+          <w:numId w:val="5"/>
+        </w:numPr>
+      </w:pPr>
+      <w:r>
+        <w:rPr>
+          <w:b/>
+          <w:bCs/>
+        </w:rPr>
+        <w:t>Description</w:t>
+      </w:r>
+      <w:r>
+        <w:t xml:space="preserve">: </w:t>
+      </w:r>
+      <w:r>
+        <w:t xml:space="preserve">Retrieves </w:t>
+      </w:r>
+      <w:r>
+        <w:t>Event Type</w:t>
+      </w:r>
+      <w:r>
+        <w:t xml:space="preserve"> list from Clerk</w:t>
+      </w:r>
+    </w:p>
+    <w:p>
+      <w:pPr>
+        <w:numPr>
+          <w:ilvl w:val="0"/>
+          <w:numId w:val="5"/>
+        </w:numPr>
+      </w:pPr>
+      <w:r>
+        <w:rPr>
+          <w:b/>
+          <w:bCs/>
+        </w:rPr>
+        <w:t xml:space="preserve">No </w:t>
+      </w:r>
+      <w:r>
+        <w:rPr>
+          <w:b/>
+          <w:bCs/>
+        </w:rPr>
+        <w:t>Request Body</w:t>
+      </w:r>
+      <w:r>
+        <w:t xml:space="preserve"> </w:t>
+      </w:r>
+    </w:p>
+    <w:p>
+      <w:pPr>
+        <w:numPr>
+          <w:ilvl w:val="0"/>
+          <w:numId w:val="5"/>
+        </w:numPr>
+      </w:pPr>
+      <w:r>
+        <w:rPr>
+          <w:b/>
+          <w:bCs/>
+        </w:rPr>
+        <w:t>Response</w:t>
+      </w:r>
+      <w:r>
+        <w:t xml:space="preserve"> (JSON): </w:t>
+      </w:r>
+    </w:p>
+    <w:p>
+      <w:pPr>
+        <w:ind w:left="1440"/>
+      </w:pPr>
+      <w:r>
+        <w:t xml:space="preserve"> </w:t>
+      </w:r>
+      <w:r>
+        <w:t>[</w:t>
+      </w:r>
+      <w:r>
+        <w:br/>
+        <w:t xml:space="preserve">    { "</w:t>
+      </w:r>
+      <w:proofErr w:type="spellStart"/>
+      <w:r>
+        <w:t>EventType</w:t>
+      </w:r>
+      <w:r>
+        <w:t>Id</w:t>
+      </w:r>
+      <w:proofErr w:type="spellEnd"/>
+      <w:r>
+        <w:t>": 1, "</w:t>
+      </w:r>
+      <w:proofErr w:type="spellStart"/>
+      <w:r>
+        <w:t>EventTypeName</w:t>
+      </w:r>
+      <w:proofErr w:type="spellEnd"/>
+      <w:r>
+        <w:t>": "</w:t>
+      </w:r>
+      <w:r>
+        <w:t xml:space="preserve"> </w:t>
+      </w:r>
+      <w:proofErr w:type="spellStart"/>
+      <w:r>
+        <w:t>Supress</w:t>
+      </w:r>
+      <w:proofErr w:type="spellEnd"/>
+      <w:r>
+        <w:t>" },</w:t>
+      </w:r>
+      <w:r>
+        <w:br/>
+        <w:t xml:space="preserve">    { "</w:t>
+      </w:r>
+      <w:r>
+        <w:t xml:space="preserve"> </w:t>
+      </w:r>
+      <w:proofErr w:type="spellStart"/>
+      <w:r>
+        <w:t>EventTypeId</w:t>
+      </w:r>
+      <w:proofErr w:type="spellEnd"/>
+      <w:r>
+        <w:t xml:space="preserve"> </w:t>
+      </w:r>
+      <w:r>
+        <w:t>": 2, "</w:t>
+      </w:r>
+      <w:r>
+        <w:t xml:space="preserve"> </w:t>
+      </w:r>
+      <w:proofErr w:type="spellStart"/>
+      <w:r>
+        <w:t>EventTypeName</w:t>
+      </w:r>
+      <w:proofErr w:type="spellEnd"/>
+      <w:r>
+        <w:t xml:space="preserve"> </w:t>
+      </w:r>
+      <w:r>
+        <w:t>": "</w:t>
+      </w:r>
+      <w:r>
+        <w:t xml:space="preserve"> </w:t>
+      </w:r>
+      <w:r>
+        <w:t>Vacate</w:t>
+      </w:r>
+      <w:r>
+        <w:t>" }</w:t>
+      </w:r>
+      <w:r>
+        <w:br/>
+        <w:t xml:space="preserve">  ]</w:t>
+      </w:r>
+    </w:p>
+    <w:p>
+      <w:pPr>
+        <w:numPr>
+          <w:ilvl w:val="1"/>
+          <w:numId w:val="5"/>
+        </w:numPr>
+      </w:pPr>
+      <w:r>
+        <w:t>Success (20</w:t>
+      </w:r>
+      <w:r>
+        <w:t>0</w:t>
+      </w:r>
+      <w:r>
+        <w:t xml:space="preserve"> </w:t>
+      </w:r>
+      <w:r>
+        <w:t>OK</w:t>
+      </w:r>
+      <w:r>
+        <w:t>)</w:t>
+      </w:r>
+    </w:p>
+    <w:p>
+      <w:pPr>
+        <w:numPr>
+          <w:ilvl w:val="1"/>
+          <w:numId w:val="5"/>
+        </w:numPr>
+      </w:pPr>
+      <w:r>
+        <w:t>Error (4xx/5xx): { "error": "Descriptive error message</w:t>
+      </w:r>
+      <w:r>
+        <w:t>"</w:t>
+      </w:r>
+      <w:r>
+        <w:t xml:space="preserve"> }</w:t>
       </w:r>
     </w:p>
     <w:p/>
@@ -3083,7 +3634,13 @@
         </w:numPr>
       </w:pPr>
       <w:r>
-        <w:t>200 OK / 201 Created: Successful operation.</w:t>
+        <w:t>200 OK / 201 Successful operation</w:t>
+      </w:r>
+      <w:r>
+        <w:t>s</w:t>
+      </w:r>
+      <w:r>
+        <w:t>.</w:t>
       </w:r>
     </w:p>
     <w:p>
@@ -3164,20 +3721,7 @@
         <w:t>Error Body</w:t>
       </w:r>
       <w:r>
-        <w:t xml:space="preserve"> (JSON): </w:t>
-      </w:r>
-      <w:proofErr w:type="gramStart"/>
-      <w:r>
-        <w:t>{ "</w:t>
-      </w:r>
-      <w:proofErr w:type="spellStart"/>
-      <w:proofErr w:type="gramEnd"/>
-      <w:r>
-        <w:t>errorMsg</w:t>
-      </w:r>
-      <w:proofErr w:type="spellEnd"/>
-      <w:r>
-        <w:t>": "Detailed message", "code": "ERROR_CODE" } (optional code for machine-readable errors).</w:t>
+        <w:t xml:space="preserve"> (JSON): { "error": "Detailed message" } </w:t>
       </w:r>
     </w:p>
     <w:p>
@@ -3196,237 +3740,6 @@
       </w:r>
       <w:r>
         <w:t>: Use schema validation (e.g., JSON Schema) to enforce field types and constraints.</w:t>
-      </w:r>
-    </w:p>
-    <w:p>
-      <w:pPr>
-        <w:rPr>
-          <w:b/>
-          <w:bCs/>
-        </w:rPr>
-      </w:pPr>
-      <w:r>
-        <w:rPr>
-          <w:b/>
-          <w:bCs/>
-        </w:rPr>
-        <w:t>4.0 Discussion</w:t>
-      </w:r>
-      <w:r>
-        <w:rPr>
-          <w:b/>
-          <w:bCs/>
-        </w:rPr>
-        <w:t xml:space="preserve"> Topics</w:t>
-      </w:r>
-    </w:p>
-    <w:p>
-      <w:pPr>
-        <w:pStyle w:val="ListParagraph"/>
-        <w:numPr>
-          <w:ilvl w:val="0"/>
-          <w:numId w:val="19"/>
-        </w:numPr>
-      </w:pPr>
-      <w:r>
-        <w:lastRenderedPageBreak/>
-        <w:t>Do we want to keep Action as is</w:t>
-      </w:r>
-      <w:r>
-        <w:t xml:space="preserve"> or convert it to an integer so that it can be Enumerated in code. If </w:t>
-      </w:r>
-      <w:r>
-        <w:t xml:space="preserve">the clerk wants to use separate endpoints for each </w:t>
-      </w:r>
-      <w:r>
-        <w:t>“Action”</w:t>
-      </w:r>
-      <w:r>
-        <w:t xml:space="preserve"> </w:t>
-      </w:r>
-      <w:r>
-        <w:rPr>
-          <w:i/>
-          <w:iCs/>
-        </w:rPr>
-        <w:t xml:space="preserve">(create, </w:t>
-      </w:r>
-      <w:r>
-        <w:rPr>
-          <w:i/>
-          <w:iCs/>
-        </w:rPr>
-        <w:t>reschedule, cancel, update</w:t>
-      </w:r>
-      <w:r>
-        <w:rPr>
-          <w:i/>
-          <w:iCs/>
-        </w:rPr>
-        <w:t>)</w:t>
-      </w:r>
-      <w:r>
-        <w:rPr>
-          <w:i/>
-          <w:iCs/>
-        </w:rPr>
-        <w:t>,</w:t>
-      </w:r>
-      <w:r>
-        <w:t xml:space="preserve"> do we even need to </w:t>
-      </w:r>
-      <w:r>
-        <w:t>include it in the request.</w:t>
-      </w:r>
-    </w:p>
-    <w:p>
-      <w:pPr>
-        <w:pStyle w:val="ListParagraph"/>
-        <w:numPr>
-          <w:ilvl w:val="0"/>
-          <w:numId w:val="19"/>
-        </w:numPr>
-      </w:pPr>
-      <w:r>
-        <w:t>U</w:t>
-      </w:r>
-      <w:r>
-        <w:t xml:space="preserve">ser Defined fields in JACS 2.0 include text alignment and type by using </w:t>
-      </w:r>
-      <w:r>
-        <w:t>pipe delimiters</w:t>
-      </w:r>
-      <w:r>
-        <w:t>, as this is how the 18</w:t>
-      </w:r>
-      <w:r>
-        <w:rPr>
-          <w:vertAlign w:val="superscript"/>
-        </w:rPr>
-        <w:t>th</w:t>
-      </w:r>
-      <w:r>
-        <w:t xml:space="preserve"> developed it. </w:t>
-      </w:r>
-      <w:r>
-        <w:t>Do we want just Field Name and Field Value</w:t>
-      </w:r>
-      <w:r>
-        <w:t xml:space="preserve">, or do we want to </w:t>
-      </w:r>
-      <w:r>
-        <w:t xml:space="preserve">expand the JSON. </w:t>
-      </w:r>
-      <w:r>
-        <w:br/>
-      </w:r>
-      <w:r>
-        <w:t>For example instead of</w:t>
-      </w:r>
-      <w:r>
-        <w:t>:</w:t>
-      </w:r>
-      <w:r>
-        <w:t xml:space="preserve"> </w:t>
-      </w:r>
-      <w:r>
-        <w:t xml:space="preserve"> </w:t>
-      </w:r>
-      <w:r>
-        <w:t>{</w:t>
-      </w:r>
-      <w:r>
-        <w:t>"</w:t>
-      </w:r>
-      <w:proofErr w:type="spellStart"/>
-      <w:r>
-        <w:t>Plaintiff_|left_|text</w:t>
-      </w:r>
-      <w:proofErr w:type="spellEnd"/>
-      <w:r>
-        <w:t>": "Joe Terhune"</w:t>
-      </w:r>
-      <w:r>
-        <w:t>}</w:t>
-      </w:r>
-      <w:r>
-        <w:br/>
-        <w:t xml:space="preserve">Change it to: </w:t>
-      </w:r>
-      <w:r>
-        <w:t>{</w:t>
-      </w:r>
-      <w:r>
-        <w:t>"Plaintiff</w:t>
-      </w:r>
-      <w:r>
-        <w:t xml:space="preserve"> </w:t>
-      </w:r>
-      <w:r>
-        <w:t>": "Joe Terhune"</w:t>
-      </w:r>
-      <w:r>
-        <w:t>,</w:t>
-      </w:r>
-      <w:r>
-        <w:t xml:space="preserve"> </w:t>
-      </w:r>
-      <w:r>
-        <w:t>"</w:t>
-      </w:r>
-      <w:r>
-        <w:t>Alignment</w:t>
-      </w:r>
-      <w:r>
-        <w:t>"</w:t>
-      </w:r>
-      <w:r>
-        <w:t>:</w:t>
-      </w:r>
-      <w:r>
-        <w:t xml:space="preserve"> </w:t>
-      </w:r>
-      <w:r>
-        <w:t>"</w:t>
-      </w:r>
-      <w:r>
-        <w:t>left</w:t>
-      </w:r>
-      <w:r>
-        <w:t>"</w:t>
-      </w:r>
-      <w:r>
-        <w:t xml:space="preserve">, </w:t>
-      </w:r>
-      <w:r>
-        <w:t>"</w:t>
-      </w:r>
-      <w:r>
-        <w:t>Type</w:t>
-      </w:r>
-      <w:r>
-        <w:t>"</w:t>
-      </w:r>
-      <w:r>
-        <w:t>:</w:t>
-      </w:r>
-      <w:r>
-        <w:t xml:space="preserve"> </w:t>
-      </w:r>
-      <w:r>
-        <w:t>"</w:t>
-      </w:r>
-      <w:r>
-        <w:t>Text</w:t>
-      </w:r>
-      <w:r>
-        <w:t>"</w:t>
-      </w:r>
-      <w:r>
-        <w:t>}</w:t>
-      </w:r>
-      <w:r>
-        <w:br/>
       </w:r>
     </w:p>
     <w:sectPr>
@@ -3461,7 +3774,7 @@
         <w:sz w:val="20"/>
       </w:rPr>
     </w:lvl>
-    <w:lvl w:ilvl="1" w:tentative="1">
+    <w:lvl w:ilvl="1">
       <w:start w:val="1"/>
       <w:numFmt w:val="bullet"/>
       <w:lvlText w:val="o"/>
@@ -5271,6 +5584,119 @@
     </w:lvl>
   </w:abstractNum>
   <w:abstractNum w:abstractNumId="13" w15:restartNumberingAfterBreak="0">
+    <w:nsid w:val="62896681"/>
+    <w:multiLevelType w:val="hybridMultilevel"/>
+    <w:tmpl w:val="821A8534"/>
+    <w:lvl w:ilvl="0" w:tplc="04090001">
+      <w:start w:val="1"/>
+      <w:numFmt w:val="bullet"/>
+      <w:lvlText w:val=""/>
+      <w:lvlJc w:val="left"/>
+      <w:pPr>
+        <w:ind w:left="720" w:hanging="360"/>
+      </w:pPr>
+      <w:rPr>
+        <w:rFonts w:ascii="Symbol" w:hAnsi="Symbol" w:hint="default"/>
+      </w:rPr>
+    </w:lvl>
+    <w:lvl w:ilvl="1" w:tplc="04090003" w:tentative="1">
+      <w:start w:val="1"/>
+      <w:numFmt w:val="bullet"/>
+      <w:lvlText w:val="o"/>
+      <w:lvlJc w:val="left"/>
+      <w:pPr>
+        <w:ind w:left="1440" w:hanging="360"/>
+      </w:pPr>
+      <w:rPr>
+        <w:rFonts w:ascii="Courier New" w:hAnsi="Courier New" w:cs="Courier New" w:hint="default"/>
+      </w:rPr>
+    </w:lvl>
+    <w:lvl w:ilvl="2" w:tplc="04090005" w:tentative="1">
+      <w:start w:val="1"/>
+      <w:numFmt w:val="bullet"/>
+      <w:lvlText w:val=""/>
+      <w:lvlJc w:val="left"/>
+      <w:pPr>
+        <w:ind w:left="2160" w:hanging="360"/>
+      </w:pPr>
+      <w:rPr>
+        <w:rFonts w:ascii="Wingdings" w:hAnsi="Wingdings" w:hint="default"/>
+      </w:rPr>
+    </w:lvl>
+    <w:lvl w:ilvl="3" w:tplc="04090001" w:tentative="1">
+      <w:start w:val="1"/>
+      <w:numFmt w:val="bullet"/>
+      <w:lvlText w:val=""/>
+      <w:lvlJc w:val="left"/>
+      <w:pPr>
+        <w:ind w:left="2880" w:hanging="360"/>
+      </w:pPr>
+      <w:rPr>
+        <w:rFonts w:ascii="Symbol" w:hAnsi="Symbol" w:hint="default"/>
+      </w:rPr>
+    </w:lvl>
+    <w:lvl w:ilvl="4" w:tplc="04090003" w:tentative="1">
+      <w:start w:val="1"/>
+      <w:numFmt w:val="bullet"/>
+      <w:lvlText w:val="o"/>
+      <w:lvlJc w:val="left"/>
+      <w:pPr>
+        <w:ind w:left="3600" w:hanging="360"/>
+      </w:pPr>
+      <w:rPr>
+        <w:rFonts w:ascii="Courier New" w:hAnsi="Courier New" w:cs="Courier New" w:hint="default"/>
+      </w:rPr>
+    </w:lvl>
+    <w:lvl w:ilvl="5" w:tplc="04090005" w:tentative="1">
+      <w:start w:val="1"/>
+      <w:numFmt w:val="bullet"/>
+      <w:lvlText w:val=""/>
+      <w:lvlJc w:val="left"/>
+      <w:pPr>
+        <w:ind w:left="4320" w:hanging="360"/>
+      </w:pPr>
+      <w:rPr>
+        <w:rFonts w:ascii="Wingdings" w:hAnsi="Wingdings" w:hint="default"/>
+      </w:rPr>
+    </w:lvl>
+    <w:lvl w:ilvl="6" w:tplc="04090001" w:tentative="1">
+      <w:start w:val="1"/>
+      <w:numFmt w:val="bullet"/>
+      <w:lvlText w:val=""/>
+      <w:lvlJc w:val="left"/>
+      <w:pPr>
+        <w:ind w:left="5040" w:hanging="360"/>
+      </w:pPr>
+      <w:rPr>
+        <w:rFonts w:ascii="Symbol" w:hAnsi="Symbol" w:hint="default"/>
+      </w:rPr>
+    </w:lvl>
+    <w:lvl w:ilvl="7" w:tplc="04090003" w:tentative="1">
+      <w:start w:val="1"/>
+      <w:numFmt w:val="bullet"/>
+      <w:lvlText w:val="o"/>
+      <w:lvlJc w:val="left"/>
+      <w:pPr>
+        <w:ind w:left="5760" w:hanging="360"/>
+      </w:pPr>
+      <w:rPr>
+        <w:rFonts w:ascii="Courier New" w:hAnsi="Courier New" w:cs="Courier New" w:hint="default"/>
+      </w:rPr>
+    </w:lvl>
+    <w:lvl w:ilvl="8" w:tplc="04090005" w:tentative="1">
+      <w:start w:val="1"/>
+      <w:numFmt w:val="bullet"/>
+      <w:lvlText w:val=""/>
+      <w:lvlJc w:val="left"/>
+      <w:pPr>
+        <w:ind w:left="6480" w:hanging="360"/>
+      </w:pPr>
+      <w:rPr>
+        <w:rFonts w:ascii="Wingdings" w:hAnsi="Wingdings" w:hint="default"/>
+      </w:rPr>
+    </w:lvl>
+  </w:abstractNum>
+  <w:abstractNum w:abstractNumId="14" w15:restartNumberingAfterBreak="0">
     <w:nsid w:val="6C6943A5"/>
     <w:multiLevelType w:val="hybridMultilevel"/>
     <w:tmpl w:val="3BC0B632"/>
@@ -5383,7 +5809,7 @@
       </w:rPr>
     </w:lvl>
   </w:abstractNum>
-  <w:abstractNum w:abstractNumId="14" w15:restartNumberingAfterBreak="0">
+  <w:abstractNum w:abstractNumId="15" w15:restartNumberingAfterBreak="0">
     <w:nsid w:val="725625B7"/>
     <w:multiLevelType w:val="multilevel"/>
     <w:tmpl w:val="52C857D2"/>
@@ -5532,7 +5958,7 @@
       </w:rPr>
     </w:lvl>
   </w:abstractNum>
-  <w:abstractNum w:abstractNumId="15" w15:restartNumberingAfterBreak="0">
+  <w:abstractNum w:abstractNumId="16" w15:restartNumberingAfterBreak="0">
     <w:nsid w:val="747A49ED"/>
     <w:multiLevelType w:val="multilevel"/>
     <w:tmpl w:val="2654E7CC"/>
@@ -5681,7 +6107,7 @@
       </w:rPr>
     </w:lvl>
   </w:abstractNum>
-  <w:abstractNum w:abstractNumId="16" w15:restartNumberingAfterBreak="0">
+  <w:abstractNum w:abstractNumId="17" w15:restartNumberingAfterBreak="0">
     <w:nsid w:val="772B08BC"/>
     <w:multiLevelType w:val="multilevel"/>
     <w:tmpl w:val="749266BC"/>
@@ -5830,7 +6256,7 @@
       </w:rPr>
     </w:lvl>
   </w:abstractNum>
-  <w:abstractNum w:abstractNumId="17" w15:restartNumberingAfterBreak="0">
+  <w:abstractNum w:abstractNumId="18" w15:restartNumberingAfterBreak="0">
     <w:nsid w:val="7C9A0025"/>
     <w:multiLevelType w:val="multilevel"/>
     <w:tmpl w:val="6480E01C"/>
@@ -5979,7 +6405,7 @@
       </w:rPr>
     </w:lvl>
   </w:abstractNum>
-  <w:abstractNum w:abstractNumId="18" w15:restartNumberingAfterBreak="0">
+  <w:abstractNum w:abstractNumId="19" w15:restartNumberingAfterBreak="0">
     <w:nsid w:val="7F8B56FB"/>
     <w:multiLevelType w:val="multilevel"/>
     <w:tmpl w:val="660683C8"/>
@@ -6132,7 +6558,7 @@
     <w:abstractNumId w:val="4"/>
   </w:num>
   <w:num w:numId="2" w16cid:durableId="372729693">
-    <w:abstractNumId w:val="18"/>
+    <w:abstractNumId w:val="19"/>
   </w:num>
   <w:num w:numId="3" w16cid:durableId="1374623144">
     <w:abstractNumId w:val="3"/>
@@ -6141,7 +6567,7 @@
     <w:abstractNumId w:val="2"/>
   </w:num>
   <w:num w:numId="5" w16cid:durableId="162015683">
-    <w:abstractNumId w:val="17"/>
+    <w:abstractNumId w:val="18"/>
   </w:num>
   <w:num w:numId="6" w16cid:durableId="91518474">
     <w:abstractNumId w:val="0"/>
@@ -6159,7 +6585,7 @@
     <w:abstractNumId w:val="11"/>
   </w:num>
   <w:num w:numId="11" w16cid:durableId="1403941019">
-    <w:abstractNumId w:val="14"/>
+    <w:abstractNumId w:val="15"/>
   </w:num>
   <w:num w:numId="12" w16cid:durableId="758330565">
     <w:abstractNumId w:val="7"/>
@@ -6168,22 +6594,25 @@
     <w:abstractNumId w:val="6"/>
   </w:num>
   <w:num w:numId="14" w16cid:durableId="1808547948">
-    <w:abstractNumId w:val="16"/>
+    <w:abstractNumId w:val="17"/>
   </w:num>
   <w:num w:numId="15" w16cid:durableId="1430546027">
     <w:abstractNumId w:val="8"/>
   </w:num>
   <w:num w:numId="16" w16cid:durableId="872421953">
-    <w:abstractNumId w:val="13"/>
+    <w:abstractNumId w:val="14"/>
   </w:num>
   <w:num w:numId="17" w16cid:durableId="1567689471">
     <w:abstractNumId w:val="1"/>
   </w:num>
   <w:num w:numId="18" w16cid:durableId="1170636048">
-    <w:abstractNumId w:val="15"/>
+    <w:abstractNumId w:val="16"/>
   </w:num>
   <w:num w:numId="19" w16cid:durableId="1275556589">
     <w:abstractNumId w:val="9"/>
+  </w:num>
+  <w:num w:numId="20" w16cid:durableId="2081974941">
+    <w:abstractNumId w:val="13"/>
   </w:num>
 </w:numbering>
 </file>

</xml_diff>